<commit_message>
updating changes to remote 22-8-2023
</commit_message>
<xml_diff>
--- a/JAVA_1.8_CONCEPTS_BY_JAVA_BRAINS.docx
+++ b/JAVA_1.8_CONCEPTS_BY_JAVA_BRAINS.docx
@@ -112,6 +112,7 @@
         </w:rPr>
         <w:br/>
       </w:r>
+      <w:proofErr w:type="gramStart"/>
       <w:r>
         <w:rPr>
           <w:rFonts w:ascii="Times New Roman" w:hAnsi="Times New Roman" w:cs="Times New Roman"/>
@@ -122,6 +123,7 @@
         </w:rPr>
         <w:t>Ans:-</w:t>
       </w:r>
+      <w:proofErr w:type="gramEnd"/>
       <w:r>
         <w:rPr>
           <w:rFonts w:ascii="Times New Roman" w:hAnsi="Times New Roman" w:cs="Times New Roman"/>
@@ -380,6 +382,7 @@
         </w:rPr>
         <w:br/>
       </w:r>
+      <w:proofErr w:type="gramStart"/>
       <w:r>
         <w:rPr>
           <w:rFonts w:ascii="Times New Roman" w:hAnsi="Times New Roman" w:cs="Times New Roman"/>
@@ -390,6 +393,7 @@
         </w:rPr>
         <w:t>Ans:-</w:t>
       </w:r>
+      <w:proofErr w:type="gramEnd"/>
       <w:r>
         <w:rPr>
           <w:rFonts w:ascii="Times New Roman" w:hAnsi="Times New Roman" w:cs="Times New Roman"/>
@@ -536,8 +540,18 @@
           <w:szCs w:val="24"/>
         </w:rPr>
         <w:br/>
-        <w:t xml:space="preserve">    - BiPredicates</w:t>
-      </w:r>
+        <w:t xml:space="preserve">    - </w:t>
+      </w:r>
+      <w:proofErr w:type="spellStart"/>
+      <w:r>
+        <w:rPr>
+          <w:rFonts w:ascii="Times New Roman" w:hAnsi="Times New Roman" w:cs="Times New Roman"/>
+          <w:sz w:val="28"/>
+          <w:szCs w:val="24"/>
+        </w:rPr>
+        <w:t>BiPredicates</w:t>
+      </w:r>
+      <w:proofErr w:type="spellEnd"/>
       <w:r>
         <w:rPr>
           <w:rFonts w:ascii="Times New Roman" w:hAnsi="Times New Roman" w:cs="Times New Roman"/>
@@ -554,8 +568,9 @@
           <w:szCs w:val="24"/>
           <w14:ligatures w14:val="none"/>
         </w:rPr>
-        <w:t xml:space="preserve">    - BiFunctions</w:t>
-      </w:r>
+        <w:t xml:space="preserve">    - </w:t>
+      </w:r>
+      <w:proofErr w:type="spellStart"/>
       <w:r>
         <w:rPr>
           <w:rFonts w:ascii="Times New Roman" w:hAnsi="Times New Roman" w:cs="Times New Roman"/>
@@ -564,9 +579,9 @@
           <w:szCs w:val="24"/>
           <w14:ligatures w14:val="none"/>
         </w:rPr>
-        <w:br/>
-        <w:t xml:space="preserve">    - BiConsumers</w:t>
-      </w:r>
+        <w:t>BiFunctions</w:t>
+      </w:r>
+      <w:proofErr w:type="spellEnd"/>
       <w:r>
         <w:rPr>
           <w:rFonts w:ascii="Times New Roman" w:hAnsi="Times New Roman" w:cs="Times New Roman"/>
@@ -576,17 +591,40 @@
           <w14:ligatures w14:val="none"/>
         </w:rPr>
         <w:br/>
-      </w:r>
-      <w:r>
-        <w:rPr>
-          <w:rFonts w:ascii="Times New Roman" w:hAnsi="Times New Roman" w:cs="Times New Roman"/>
-          <w:b/>
-          <w:bCs/>
+        <w:t xml:space="preserve">    - </w:t>
+      </w:r>
+      <w:proofErr w:type="spellStart"/>
+      <w:r>
+        <w:rPr>
+          <w:rFonts w:ascii="Times New Roman" w:hAnsi="Times New Roman" w:cs="Times New Roman"/>
           <w:kern w:val="0"/>
           <w:sz w:val="28"/>
           <w:szCs w:val="24"/>
           <w14:ligatures w14:val="none"/>
         </w:rPr>
+        <w:t>BiConsumers</w:t>
+      </w:r>
+      <w:proofErr w:type="spellEnd"/>
+      <w:r>
+        <w:rPr>
+          <w:rFonts w:ascii="Times New Roman" w:hAnsi="Times New Roman" w:cs="Times New Roman"/>
+          <w:kern w:val="0"/>
+          <w:sz w:val="28"/>
+          <w:szCs w:val="24"/>
+          <w14:ligatures w14:val="none"/>
+        </w:rPr>
+        <w:br/>
+      </w:r>
+      <w:r>
+        <w:rPr>
+          <w:rFonts w:ascii="Times New Roman" w:hAnsi="Times New Roman" w:cs="Times New Roman"/>
+          <w:b/>
+          <w:bCs/>
+          <w:kern w:val="0"/>
+          <w:sz w:val="28"/>
+          <w:szCs w:val="24"/>
+          <w14:ligatures w14:val="none"/>
+        </w:rPr>
         <w:t>*</w:t>
       </w:r>
       <w:r>
@@ -629,7 +667,29 @@
           <w:szCs w:val="24"/>
           <w14:ligatures w14:val="none"/>
         </w:rPr>
-        <w:t xml:space="preserve"> Date and Time API or Joda API</w:t>
+        <w:t xml:space="preserve"> Date and Time API or </w:t>
+      </w:r>
+      <w:proofErr w:type="spellStart"/>
+      <w:r>
+        <w:rPr>
+          <w:rFonts w:ascii="Times New Roman" w:hAnsi="Times New Roman" w:cs="Times New Roman"/>
+          <w:kern w:val="0"/>
+          <w:sz w:val="28"/>
+          <w:szCs w:val="24"/>
+          <w14:ligatures w14:val="none"/>
+        </w:rPr>
+        <w:t>Joda</w:t>
+      </w:r>
+      <w:proofErr w:type="spellEnd"/>
+      <w:r>
+        <w:rPr>
+          <w:rFonts w:ascii="Times New Roman" w:hAnsi="Times New Roman" w:cs="Times New Roman"/>
+          <w:kern w:val="0"/>
+          <w:sz w:val="28"/>
+          <w:szCs w:val="24"/>
+          <w14:ligatures w14:val="none"/>
+        </w:rPr>
+        <w:t xml:space="preserve"> API</w:t>
       </w:r>
       <w:r>
         <w:rPr>
@@ -698,6 +758,7 @@
         </w:rPr>
         <w:br/>
       </w:r>
+      <w:proofErr w:type="gramStart"/>
       <w:r>
         <w:rPr>
           <w:rFonts w:ascii="Times New Roman" w:hAnsi="Times New Roman" w:cs="Times New Roman"/>
@@ -708,6 +769,7 @@
         </w:rPr>
         <w:t>Ans:-</w:t>
       </w:r>
+      <w:proofErr w:type="gramEnd"/>
       <w:r>
         <w:rPr>
           <w:rFonts w:ascii="Times New Roman" w:hAnsi="Times New Roman" w:cs="Times New Roman"/>
@@ -724,8 +786,20 @@
           <w:sz w:val="28"/>
           <w:szCs w:val="24"/>
         </w:rPr>
-        <w:t>Which has NO Name, NO Modifiers, NO ReturnType</w:t>
-      </w:r>
+        <w:t xml:space="preserve">Which has NO Name, NO Modifiers, NO </w:t>
+      </w:r>
+      <w:proofErr w:type="spellStart"/>
+      <w:r>
+        <w:rPr>
+          <w:rFonts w:ascii="Times New Roman" w:hAnsi="Times New Roman" w:cs="Times New Roman"/>
+          <w:b/>
+          <w:bCs/>
+          <w:sz w:val="28"/>
+          <w:szCs w:val="24"/>
+        </w:rPr>
+        <w:t>ReturnType</w:t>
+      </w:r>
+      <w:proofErr w:type="spellEnd"/>
       <w:r>
         <w:rPr>
           <w:rFonts w:ascii="Times New Roman" w:hAnsi="Times New Roman" w:cs="Times New Roman"/>
@@ -764,6 +838,7 @@
         </w:rPr>
         <w:br/>
       </w:r>
+      <w:proofErr w:type="gramStart"/>
       <w:r>
         <w:rPr>
           <w:rFonts w:ascii="Times New Roman" w:hAnsi="Times New Roman" w:cs="Times New Roman"/>
@@ -774,6 +849,7 @@
         </w:rPr>
         <w:t>Ans:-</w:t>
       </w:r>
+      <w:proofErr w:type="gramEnd"/>
       <w:r>
         <w:rPr>
           <w:rFonts w:ascii="Times New Roman" w:hAnsi="Times New Roman" w:cs="Times New Roman"/>
@@ -936,6 +1012,7 @@
         </w:rPr>
         <w:br/>
       </w:r>
+      <w:proofErr w:type="gramStart"/>
       <w:r>
         <w:rPr>
           <w:rFonts w:ascii="Times New Roman" w:hAnsi="Times New Roman" w:cs="Times New Roman"/>
@@ -946,6 +1023,7 @@
         </w:rPr>
         <w:t>Ans:-</w:t>
       </w:r>
+      <w:proofErr w:type="gramEnd"/>
       <w:r>
         <w:rPr>
           <w:rFonts w:ascii="Times New Roman" w:hAnsi="Times New Roman" w:cs="Times New Roman"/>
@@ -1499,7 +1577,25 @@
           <w:sz w:val="28"/>
           <w:szCs w:val="24"/>
         </w:rPr>
-        <w:t xml:space="preserve">, It will reduce the Developers efforts by conciseing (reducing the lines of code) the code. And it increases the readability of a code. </w:t>
+        <w:t xml:space="preserve">, It will reduce the Developers efforts by </w:t>
+      </w:r>
+      <w:proofErr w:type="spellStart"/>
+      <w:r>
+        <w:rPr>
+          <w:rFonts w:ascii="Times New Roman" w:hAnsi="Times New Roman" w:cs="Times New Roman"/>
+          <w:sz w:val="28"/>
+          <w:szCs w:val="24"/>
+        </w:rPr>
+        <w:t>conciseing</w:t>
+      </w:r>
+      <w:proofErr w:type="spellEnd"/>
+      <w:r>
+        <w:rPr>
+          <w:rFonts w:ascii="Times New Roman" w:hAnsi="Times New Roman" w:cs="Times New Roman"/>
+          <w:sz w:val="28"/>
+          <w:szCs w:val="24"/>
+        </w:rPr>
+        <w:t xml:space="preserve"> (reducing the lines of code) the code. And it increases the readability of a code. </w:t>
       </w:r>
       <w:r>
         <w:rPr>
@@ -1518,8 +1614,21 @@
           <w:szCs w:val="24"/>
           <w:u w:val="single"/>
         </w:rPr>
-        <w:t>Biggest Advantage of Functional Programming:-</w:t>
-      </w:r>
+        <w:t xml:space="preserve">Biggest Advantage of Functional </w:t>
+      </w:r>
+      <w:proofErr w:type="gramStart"/>
+      <w:r>
+        <w:rPr>
+          <w:rFonts w:ascii="Times New Roman" w:hAnsi="Times New Roman" w:cs="Times New Roman"/>
+          <w:b/>
+          <w:bCs/>
+          <w:sz w:val="28"/>
+          <w:szCs w:val="24"/>
+          <w:u w:val="single"/>
+        </w:rPr>
+        <w:t>Programming:-</w:t>
+      </w:r>
+      <w:proofErr w:type="gramEnd"/>
       <w:r>
         <w:rPr>
           <w:rFonts w:ascii="Times New Roman" w:hAnsi="Times New Roman" w:cs="Times New Roman"/>
@@ -1587,7 +1696,18 @@
           <w:sz w:val="28"/>
           <w:szCs w:val="24"/>
         </w:rPr>
-        <w:t>Functional Interface</w:t>
+        <w:t xml:space="preserve">Functional </w:t>
+      </w:r>
+      <w:proofErr w:type="gramStart"/>
+      <w:r>
+        <w:rPr>
+          <w:rFonts w:ascii="Times New Roman" w:hAnsi="Times New Roman" w:cs="Times New Roman"/>
+          <w:b/>
+          <w:bCs/>
+          <w:sz w:val="28"/>
+          <w:szCs w:val="24"/>
+        </w:rPr>
+        <w:t>Interface</w:t>
       </w:r>
       <w:r>
         <w:rPr>
@@ -1597,6 +1717,7 @@
         </w:rPr>
         <w:t xml:space="preserve"> ?</w:t>
       </w:r>
+      <w:proofErr w:type="gramEnd"/>
       <w:r>
         <w:rPr>
           <w:rFonts w:ascii="Times New Roman" w:hAnsi="Times New Roman" w:cs="Times New Roman"/>
@@ -1698,6 +1819,7 @@
         </w:rPr>
         <w:br/>
       </w:r>
+      <w:proofErr w:type="gramStart"/>
       <w:r>
         <w:rPr>
           <w:rFonts w:ascii="Times New Roman" w:hAnsi="Times New Roman" w:cs="Times New Roman"/>
@@ -1708,6 +1830,7 @@
         </w:rPr>
         <w:t>Ans:-</w:t>
       </w:r>
+      <w:proofErr w:type="gramEnd"/>
       <w:r>
         <w:rPr>
           <w:rFonts w:ascii="Times New Roman" w:hAnsi="Times New Roman" w:cs="Times New Roman"/>
@@ -1827,6 +1950,7 @@
         </w:rPr>
         <w:br/>
       </w:r>
+      <w:proofErr w:type="gramStart"/>
       <w:r>
         <w:rPr>
           <w:rFonts w:ascii="Times New Roman" w:hAnsi="Times New Roman" w:cs="Times New Roman"/>
@@ -1837,6 +1961,7 @@
         </w:rPr>
         <w:t>Ans:-</w:t>
       </w:r>
+      <w:proofErr w:type="gramEnd"/>
       <w:r>
         <w:rPr>
           <w:rFonts w:ascii="Times New Roman" w:hAnsi="Times New Roman" w:cs="Times New Roman"/>
@@ -1899,7 +2024,25 @@
           <w:sz w:val="28"/>
           <w:szCs w:val="24"/>
         </w:rPr>
-        <w:t xml:space="preserve"> interface BUT as per Java we cant create Object for interface but we can create an implementation class for it, this Anonymous class is also equivalent to implementation class but it has NO-NAME</w:t>
+        <w:t xml:space="preserve"> interface BUT as per Java we </w:t>
+      </w:r>
+      <w:proofErr w:type="spellStart"/>
+      <w:r>
+        <w:rPr>
+          <w:rFonts w:ascii="Times New Roman" w:hAnsi="Times New Roman" w:cs="Times New Roman"/>
+          <w:sz w:val="28"/>
+          <w:szCs w:val="24"/>
+        </w:rPr>
+        <w:t>cant</w:t>
+      </w:r>
+      <w:proofErr w:type="spellEnd"/>
+      <w:r>
+        <w:rPr>
+          <w:rFonts w:ascii="Times New Roman" w:hAnsi="Times New Roman" w:cs="Times New Roman"/>
+          <w:sz w:val="28"/>
+          <w:szCs w:val="24"/>
+        </w:rPr>
+        <w:t xml:space="preserve"> create Object for interface but we can create an implementation class for it, this Anonymous class is also equivalent to implementation class but it has NO-NAME</w:t>
       </w:r>
       <w:r>
         <w:rPr>
@@ -2293,6 +2436,7 @@
         </w:rPr>
         <w:br/>
       </w:r>
+      <w:proofErr w:type="gramStart"/>
       <w:r>
         <w:rPr>
           <w:rFonts w:ascii="Times New Roman" w:hAnsi="Times New Roman" w:cs="Times New Roman"/>
@@ -2304,6 +2448,7 @@
         </w:rPr>
         <w:t>Ans:-</w:t>
       </w:r>
+      <w:proofErr w:type="gramEnd"/>
       <w:r>
         <w:rPr>
           <w:rFonts w:ascii="Times New Roman" w:hAnsi="Times New Roman" w:cs="Times New Roman"/>
@@ -2368,23 +2513,7 @@
           <w:sz w:val="28"/>
           <w:szCs w:val="24"/>
         </w:rPr>
-        <w:t xml:space="preserve"> </w:t>
-      </w:r>
-      <w:r>
-        <w:rPr>
-          <w:rFonts w:ascii="Times New Roman" w:hAnsi="Times New Roman" w:cs="Times New Roman"/>
-          <w:sz w:val="28"/>
-          <w:szCs w:val="24"/>
-        </w:rPr>
-        <w:t>class</w:t>
-      </w:r>
-      <w:r>
-        <w:rPr>
-          <w:rFonts w:ascii="Times New Roman" w:hAnsi="Times New Roman" w:cs="Times New Roman"/>
-          <w:sz w:val="28"/>
-          <w:szCs w:val="24"/>
-        </w:rPr>
-        <w:t xml:space="preserve"> at location :-&gt; </w:t>
+        <w:t xml:space="preserve"> class at location :-&gt; </w:t>
       </w:r>
       <w:r>
         <w:rPr>
@@ -2432,6 +2561,1052 @@
         </w:rPr>
         <w:br/>
       </w:r>
+      <w:proofErr w:type="gramStart"/>
+      <w:r>
+        <w:rPr>
+          <w:rFonts w:ascii="Times New Roman" w:hAnsi="Times New Roman" w:cs="Times New Roman"/>
+          <w:b/>
+          <w:bCs/>
+          <w:sz w:val="28"/>
+          <w:szCs w:val="24"/>
+          <w:u w:val="single"/>
+        </w:rPr>
+        <w:t>Ans:-</w:t>
+      </w:r>
+      <w:proofErr w:type="gramEnd"/>
+      <w:r>
+        <w:rPr>
+          <w:rFonts w:ascii="Times New Roman" w:hAnsi="Times New Roman" w:cs="Times New Roman"/>
+          <w:sz w:val="28"/>
+          <w:szCs w:val="24"/>
+        </w:rPr>
+        <w:t xml:space="preserve"> </w:t>
+      </w:r>
+      <w:r>
+        <w:rPr>
+          <w:rFonts w:ascii="Times New Roman" w:hAnsi="Times New Roman" w:cs="Times New Roman"/>
+          <w:sz w:val="28"/>
+          <w:szCs w:val="24"/>
+        </w:rPr>
+        <w:br/>
+      </w:r>
+    </w:p>
+    <w:tbl>
+      <w:tblPr>
+        <w:tblW w:w="8310" w:type="dxa"/>
+        <w:tblInd w:w="710" w:type="dxa"/>
+        <w:tblLook w:val="04A0" w:firstRow="1" w:lastRow="0" w:firstColumn="1" w:lastColumn="0" w:noHBand="0" w:noVBand="1"/>
+      </w:tblPr>
+      <w:tblGrid>
+        <w:gridCol w:w="1900"/>
+        <w:gridCol w:w="1920"/>
+        <w:gridCol w:w="2390"/>
+        <w:gridCol w:w="2100"/>
+      </w:tblGrid>
+      <w:tr>
+        <w:trPr>
+          <w:trHeight w:val="288"/>
+        </w:trPr>
+        <w:tc>
+          <w:tcPr>
+            <w:tcW w:w="1900" w:type="dxa"/>
+            <w:tcBorders>
+              <w:top w:val="single" w:sz="12" w:space="0" w:color="auto"/>
+              <w:left w:val="single" w:sz="12" w:space="0" w:color="auto"/>
+              <w:bottom w:val="single" w:sz="12" w:space="0" w:color="auto"/>
+              <w:right w:val="single" w:sz="12" w:space="0" w:color="auto"/>
+            </w:tcBorders>
+            <w:shd w:val="clear" w:color="auto" w:fill="auto"/>
+            <w:noWrap/>
+            <w:vAlign w:val="center"/>
+            <w:hideMark/>
+          </w:tcPr>
+          <w:p>
+            <w:pPr>
+              <w:spacing w:after="0" w:line="240" w:lineRule="auto"/>
+              <w:jc w:val="center"/>
+              <w:rPr>
+                <w:rFonts w:ascii="Calibri" w:eastAsia="Times New Roman" w:hAnsi="Calibri" w:cs="Calibri"/>
+                <w:b/>
+                <w:bCs/>
+                <w:color w:val="000000"/>
+                <w:kern w:val="0"/>
+                <w:szCs w:val="22"/>
+                <w:lang w:bidi="ar-SA"/>
+                <w14:ligatures w14:val="none"/>
+              </w:rPr>
+            </w:pPr>
+            <w:r>
+              <w:rPr>
+                <w:rFonts w:ascii="Calibri" w:eastAsia="Times New Roman" w:hAnsi="Calibri" w:cs="Calibri"/>
+                <w:b/>
+                <w:bCs/>
+                <w:color w:val="000000"/>
+                <w:kern w:val="0"/>
+                <w:szCs w:val="22"/>
+                <w:lang w:bidi="ar-SA"/>
+                <w14:ligatures w14:val="none"/>
+              </w:rPr>
+              <w:t>Functional Interface</w:t>
+            </w:r>
+          </w:p>
+        </w:tc>
+        <w:tc>
+          <w:tcPr>
+            <w:tcW w:w="1920" w:type="dxa"/>
+            <w:tcBorders>
+              <w:top w:val="single" w:sz="12" w:space="0" w:color="auto"/>
+              <w:left w:val="single" w:sz="12" w:space="0" w:color="auto"/>
+              <w:bottom w:val="single" w:sz="12" w:space="0" w:color="auto"/>
+              <w:right w:val="single" w:sz="12" w:space="0" w:color="auto"/>
+            </w:tcBorders>
+            <w:shd w:val="clear" w:color="auto" w:fill="auto"/>
+            <w:noWrap/>
+            <w:vAlign w:val="center"/>
+            <w:hideMark/>
+          </w:tcPr>
+          <w:p>
+            <w:pPr>
+              <w:spacing w:after="0" w:line="240" w:lineRule="auto"/>
+              <w:jc w:val="center"/>
+              <w:rPr>
+                <w:rFonts w:ascii="Calibri" w:eastAsia="Times New Roman" w:hAnsi="Calibri" w:cs="Calibri"/>
+                <w:b/>
+                <w:bCs/>
+                <w:color w:val="000000"/>
+                <w:kern w:val="0"/>
+                <w:szCs w:val="22"/>
+                <w:lang w:bidi="ar-SA"/>
+                <w14:ligatures w14:val="none"/>
+              </w:rPr>
+            </w:pPr>
+            <w:r>
+              <w:rPr>
+                <w:rFonts w:ascii="Calibri" w:eastAsia="Times New Roman" w:hAnsi="Calibri" w:cs="Calibri"/>
+                <w:b/>
+                <w:bCs/>
+                <w:color w:val="000000"/>
+                <w:kern w:val="0"/>
+                <w:szCs w:val="22"/>
+                <w:lang w:bidi="ar-SA"/>
+                <w14:ligatures w14:val="none"/>
+              </w:rPr>
+              <w:t>Method Name</w:t>
+            </w:r>
+          </w:p>
+        </w:tc>
+        <w:tc>
+          <w:tcPr>
+            <w:tcW w:w="2390" w:type="dxa"/>
+            <w:tcBorders>
+              <w:top w:val="single" w:sz="12" w:space="0" w:color="auto"/>
+              <w:left w:val="single" w:sz="12" w:space="0" w:color="auto"/>
+              <w:bottom w:val="single" w:sz="12" w:space="0" w:color="auto"/>
+              <w:right w:val="single" w:sz="12" w:space="0" w:color="auto"/>
+            </w:tcBorders>
+            <w:shd w:val="clear" w:color="auto" w:fill="auto"/>
+            <w:vAlign w:val="center"/>
+            <w:hideMark/>
+          </w:tcPr>
+          <w:p>
+            <w:pPr>
+              <w:spacing w:after="0" w:line="240" w:lineRule="auto"/>
+              <w:jc w:val="center"/>
+              <w:rPr>
+                <w:rFonts w:ascii="Calibri" w:eastAsia="Times New Roman" w:hAnsi="Calibri" w:cs="Calibri"/>
+                <w:b/>
+                <w:bCs/>
+                <w:color w:val="000000"/>
+                <w:kern w:val="0"/>
+                <w:szCs w:val="22"/>
+                <w:lang w:bidi="ar-SA"/>
+                <w14:ligatures w14:val="none"/>
+              </w:rPr>
+            </w:pPr>
+            <w:r>
+              <w:rPr>
+                <w:rFonts w:ascii="Calibri" w:eastAsia="Times New Roman" w:hAnsi="Calibri" w:cs="Calibri"/>
+                <w:b/>
+                <w:bCs/>
+                <w:color w:val="000000"/>
+                <w:kern w:val="0"/>
+                <w:szCs w:val="22"/>
+                <w:lang w:bidi="ar-SA"/>
+                <w14:ligatures w14:val="none"/>
+              </w:rPr>
+              <w:t>Return type of method</w:t>
+            </w:r>
+          </w:p>
+        </w:tc>
+        <w:tc>
+          <w:tcPr>
+            <w:tcW w:w="2100" w:type="dxa"/>
+            <w:tcBorders>
+              <w:top w:val="single" w:sz="12" w:space="0" w:color="auto"/>
+              <w:left w:val="single" w:sz="12" w:space="0" w:color="auto"/>
+              <w:bottom w:val="single" w:sz="12" w:space="0" w:color="auto"/>
+              <w:right w:val="single" w:sz="12" w:space="0" w:color="auto"/>
+            </w:tcBorders>
+            <w:shd w:val="clear" w:color="auto" w:fill="auto"/>
+            <w:noWrap/>
+            <w:vAlign w:val="center"/>
+            <w:hideMark/>
+          </w:tcPr>
+          <w:p>
+            <w:pPr>
+              <w:spacing w:after="0" w:line="240" w:lineRule="auto"/>
+              <w:jc w:val="center"/>
+              <w:rPr>
+                <w:rFonts w:ascii="Calibri" w:eastAsia="Times New Roman" w:hAnsi="Calibri" w:cs="Calibri"/>
+                <w:b/>
+                <w:bCs/>
+                <w:color w:val="000000"/>
+                <w:kern w:val="0"/>
+                <w:szCs w:val="22"/>
+                <w:lang w:bidi="ar-SA"/>
+                <w14:ligatures w14:val="none"/>
+              </w:rPr>
+            </w:pPr>
+            <w:proofErr w:type="spellStart"/>
+            <w:r>
+              <w:rPr>
+                <w:rFonts w:ascii="Calibri" w:eastAsia="Times New Roman" w:hAnsi="Calibri" w:cs="Calibri"/>
+                <w:b/>
+                <w:bCs/>
+                <w:color w:val="000000"/>
+                <w:kern w:val="0"/>
+                <w:szCs w:val="22"/>
+                <w:lang w:bidi="ar-SA"/>
+                <w14:ligatures w14:val="none"/>
+              </w:rPr>
+              <w:t>ShortCut</w:t>
+            </w:r>
+            <w:proofErr w:type="spellEnd"/>
+            <w:r>
+              <w:rPr>
+                <w:rFonts w:ascii="Calibri" w:eastAsia="Times New Roman" w:hAnsi="Calibri" w:cs="Calibri"/>
+                <w:b/>
+                <w:bCs/>
+                <w:color w:val="000000"/>
+                <w:kern w:val="0"/>
+                <w:szCs w:val="22"/>
+                <w:lang w:bidi="ar-SA"/>
+                <w14:ligatures w14:val="none"/>
+              </w:rPr>
+              <w:t xml:space="preserve"> to remember</w:t>
+            </w:r>
+          </w:p>
+        </w:tc>
+      </w:tr>
+      <w:tr>
+        <w:trPr>
+          <w:trHeight w:val="288"/>
+        </w:trPr>
+        <w:tc>
+          <w:tcPr>
+            <w:tcW w:w="1900" w:type="dxa"/>
+            <w:tcBorders>
+              <w:top w:val="single" w:sz="12" w:space="0" w:color="auto"/>
+              <w:left w:val="single" w:sz="12" w:space="0" w:color="auto"/>
+              <w:bottom w:val="single" w:sz="4" w:space="0" w:color="auto"/>
+              <w:right w:val="single" w:sz="12" w:space="0" w:color="auto"/>
+            </w:tcBorders>
+            <w:shd w:val="clear" w:color="auto" w:fill="auto"/>
+            <w:noWrap/>
+            <w:vAlign w:val="center"/>
+            <w:hideMark/>
+          </w:tcPr>
+          <w:p>
+            <w:pPr>
+              <w:spacing w:after="0" w:line="240" w:lineRule="auto"/>
+              <w:jc w:val="center"/>
+              <w:rPr>
+                <w:rFonts w:ascii="Calibri" w:eastAsia="Times New Roman" w:hAnsi="Calibri" w:cs="Calibri"/>
+                <w:color w:val="000000"/>
+                <w:kern w:val="0"/>
+                <w:szCs w:val="22"/>
+                <w:lang w:bidi="ar-SA"/>
+                <w14:ligatures w14:val="none"/>
+              </w:rPr>
+            </w:pPr>
+            <w:r>
+              <w:rPr>
+                <w:rFonts w:ascii="Calibri" w:eastAsia="Times New Roman" w:hAnsi="Calibri" w:cs="Calibri"/>
+                <w:color w:val="000000"/>
+                <w:kern w:val="0"/>
+                <w:szCs w:val="22"/>
+                <w:lang w:bidi="ar-SA"/>
+                <w14:ligatures w14:val="none"/>
+              </w:rPr>
+              <w:t>Predicate&lt;T&gt;</w:t>
+            </w:r>
+          </w:p>
+        </w:tc>
+        <w:tc>
+          <w:tcPr>
+            <w:tcW w:w="1920" w:type="dxa"/>
+            <w:tcBorders>
+              <w:top w:val="single" w:sz="12" w:space="0" w:color="auto"/>
+              <w:left w:val="single" w:sz="12" w:space="0" w:color="auto"/>
+              <w:bottom w:val="single" w:sz="4" w:space="0" w:color="auto"/>
+              <w:right w:val="single" w:sz="12" w:space="0" w:color="auto"/>
+            </w:tcBorders>
+            <w:shd w:val="clear" w:color="auto" w:fill="auto"/>
+            <w:noWrap/>
+            <w:vAlign w:val="center"/>
+            <w:hideMark/>
+          </w:tcPr>
+          <w:p>
+            <w:pPr>
+              <w:spacing w:after="0" w:line="240" w:lineRule="auto"/>
+              <w:jc w:val="center"/>
+              <w:rPr>
+                <w:rFonts w:ascii="Calibri" w:eastAsia="Times New Roman" w:hAnsi="Calibri" w:cs="Calibri"/>
+                <w:color w:val="000000"/>
+                <w:kern w:val="0"/>
+                <w:szCs w:val="22"/>
+                <w:lang w:bidi="ar-SA"/>
+                <w14:ligatures w14:val="none"/>
+              </w:rPr>
+            </w:pPr>
+            <w:r>
+              <w:rPr>
+                <w:rFonts w:ascii="Calibri" w:eastAsia="Times New Roman" w:hAnsi="Calibri" w:cs="Calibri"/>
+                <w:color w:val="000000"/>
+                <w:kern w:val="0"/>
+                <w:szCs w:val="22"/>
+                <w:lang w:bidi="ar-SA"/>
+                <w14:ligatures w14:val="none"/>
+              </w:rPr>
+              <w:t>test(T t)</w:t>
+            </w:r>
+          </w:p>
+        </w:tc>
+        <w:tc>
+          <w:tcPr>
+            <w:tcW w:w="2390" w:type="dxa"/>
+            <w:tcBorders>
+              <w:top w:val="single" w:sz="12" w:space="0" w:color="auto"/>
+              <w:left w:val="single" w:sz="12" w:space="0" w:color="auto"/>
+              <w:bottom w:val="single" w:sz="4" w:space="0" w:color="auto"/>
+              <w:right w:val="single" w:sz="12" w:space="0" w:color="auto"/>
+            </w:tcBorders>
+            <w:shd w:val="clear" w:color="auto" w:fill="auto"/>
+            <w:vAlign w:val="center"/>
+            <w:hideMark/>
+          </w:tcPr>
+          <w:p>
+            <w:pPr>
+              <w:spacing w:after="0" w:line="240" w:lineRule="auto"/>
+              <w:jc w:val="center"/>
+              <w:rPr>
+                <w:rFonts w:ascii="Calibri" w:eastAsia="Times New Roman" w:hAnsi="Calibri" w:cs="Calibri"/>
+                <w:color w:val="000000"/>
+                <w:kern w:val="0"/>
+                <w:szCs w:val="22"/>
+                <w:lang w:bidi="ar-SA"/>
+                <w14:ligatures w14:val="none"/>
+              </w:rPr>
+            </w:pPr>
+            <w:r>
+              <w:rPr>
+                <w:rFonts w:ascii="Calibri" w:eastAsia="Times New Roman" w:hAnsi="Calibri" w:cs="Calibri"/>
+                <w:color w:val="000000"/>
+                <w:kern w:val="0"/>
+                <w:szCs w:val="22"/>
+                <w:lang w:bidi="ar-SA"/>
+                <w14:ligatures w14:val="none"/>
+              </w:rPr>
+              <w:t>Boolean</w:t>
+            </w:r>
+          </w:p>
+        </w:tc>
+        <w:tc>
+          <w:tcPr>
+            <w:tcW w:w="2100" w:type="dxa"/>
+            <w:tcBorders>
+              <w:top w:val="single" w:sz="12" w:space="0" w:color="auto"/>
+              <w:left w:val="single" w:sz="12" w:space="0" w:color="auto"/>
+              <w:bottom w:val="single" w:sz="4" w:space="0" w:color="auto"/>
+              <w:right w:val="single" w:sz="12" w:space="0" w:color="auto"/>
+            </w:tcBorders>
+            <w:shd w:val="clear" w:color="auto" w:fill="auto"/>
+            <w:noWrap/>
+            <w:vAlign w:val="center"/>
+            <w:hideMark/>
+          </w:tcPr>
+          <w:p>
+            <w:pPr>
+              <w:spacing w:after="0" w:line="240" w:lineRule="auto"/>
+              <w:jc w:val="center"/>
+              <w:rPr>
+                <w:rFonts w:ascii="Calibri" w:eastAsia="Times New Roman" w:hAnsi="Calibri" w:cs="Calibri"/>
+                <w:color w:val="000000"/>
+                <w:kern w:val="0"/>
+                <w:szCs w:val="22"/>
+                <w:lang w:bidi="ar-SA"/>
+                <w14:ligatures w14:val="none"/>
+              </w:rPr>
+            </w:pPr>
+            <w:r>
+              <w:rPr>
+                <w:rFonts w:ascii="Calibri" w:eastAsia="Times New Roman" w:hAnsi="Calibri" w:cs="Calibri"/>
+                <w:color w:val="000000"/>
+                <w:kern w:val="0"/>
+                <w:szCs w:val="22"/>
+                <w:lang w:bidi="ar-SA"/>
+                <w14:ligatures w14:val="none"/>
+              </w:rPr>
+              <w:t>PTB</w:t>
+            </w:r>
+          </w:p>
+        </w:tc>
+      </w:tr>
+      <w:tr>
+        <w:trPr>
+          <w:trHeight w:val="288"/>
+        </w:trPr>
+        <w:tc>
+          <w:tcPr>
+            <w:tcW w:w="1900" w:type="dxa"/>
+            <w:tcBorders>
+              <w:top w:val="nil"/>
+              <w:left w:val="single" w:sz="12" w:space="0" w:color="auto"/>
+              <w:bottom w:val="single" w:sz="4" w:space="0" w:color="auto"/>
+              <w:right w:val="single" w:sz="12" w:space="0" w:color="auto"/>
+            </w:tcBorders>
+            <w:shd w:val="clear" w:color="auto" w:fill="auto"/>
+            <w:noWrap/>
+            <w:vAlign w:val="center"/>
+            <w:hideMark/>
+          </w:tcPr>
+          <w:p>
+            <w:pPr>
+              <w:spacing w:after="0" w:line="240" w:lineRule="auto"/>
+              <w:jc w:val="center"/>
+              <w:rPr>
+                <w:rFonts w:ascii="Calibri" w:eastAsia="Times New Roman" w:hAnsi="Calibri" w:cs="Calibri"/>
+                <w:color w:val="000000"/>
+                <w:kern w:val="0"/>
+                <w:szCs w:val="22"/>
+                <w:lang w:bidi="ar-SA"/>
+                <w14:ligatures w14:val="none"/>
+              </w:rPr>
+            </w:pPr>
+            <w:r>
+              <w:rPr>
+                <w:rFonts w:ascii="Calibri" w:eastAsia="Times New Roman" w:hAnsi="Calibri" w:cs="Calibri"/>
+                <w:color w:val="000000"/>
+                <w:kern w:val="0"/>
+                <w:szCs w:val="22"/>
+                <w:lang w:bidi="ar-SA"/>
+                <w14:ligatures w14:val="none"/>
+              </w:rPr>
+              <w:t>Supplier&lt;T&gt;</w:t>
+            </w:r>
+          </w:p>
+        </w:tc>
+        <w:tc>
+          <w:tcPr>
+            <w:tcW w:w="1920" w:type="dxa"/>
+            <w:tcBorders>
+              <w:top w:val="nil"/>
+              <w:left w:val="single" w:sz="12" w:space="0" w:color="auto"/>
+              <w:bottom w:val="single" w:sz="4" w:space="0" w:color="auto"/>
+              <w:right w:val="single" w:sz="12" w:space="0" w:color="auto"/>
+            </w:tcBorders>
+            <w:shd w:val="clear" w:color="auto" w:fill="auto"/>
+            <w:noWrap/>
+            <w:vAlign w:val="center"/>
+            <w:hideMark/>
+          </w:tcPr>
+          <w:p>
+            <w:pPr>
+              <w:spacing w:after="0" w:line="240" w:lineRule="auto"/>
+              <w:jc w:val="center"/>
+              <w:rPr>
+                <w:rFonts w:ascii="Calibri" w:eastAsia="Times New Roman" w:hAnsi="Calibri" w:cs="Calibri"/>
+                <w:color w:val="000000"/>
+                <w:kern w:val="0"/>
+                <w:szCs w:val="22"/>
+                <w:lang w:bidi="ar-SA"/>
+                <w14:ligatures w14:val="none"/>
+              </w:rPr>
+            </w:pPr>
+            <w:r>
+              <w:rPr>
+                <w:rFonts w:ascii="Calibri" w:eastAsia="Times New Roman" w:hAnsi="Calibri" w:cs="Calibri"/>
+                <w:color w:val="000000"/>
+                <w:kern w:val="0"/>
+                <w:szCs w:val="22"/>
+                <w:lang w:bidi="ar-SA"/>
+                <w14:ligatures w14:val="none"/>
+              </w:rPr>
+              <w:t>get()</w:t>
+            </w:r>
+          </w:p>
+        </w:tc>
+        <w:tc>
+          <w:tcPr>
+            <w:tcW w:w="2390" w:type="dxa"/>
+            <w:tcBorders>
+              <w:top w:val="nil"/>
+              <w:left w:val="single" w:sz="12" w:space="0" w:color="auto"/>
+              <w:bottom w:val="single" w:sz="4" w:space="0" w:color="auto"/>
+              <w:right w:val="single" w:sz="12" w:space="0" w:color="auto"/>
+            </w:tcBorders>
+            <w:shd w:val="clear" w:color="auto" w:fill="auto"/>
+            <w:vAlign w:val="center"/>
+            <w:hideMark/>
+          </w:tcPr>
+          <w:p>
+            <w:pPr>
+              <w:spacing w:after="0" w:line="240" w:lineRule="auto"/>
+              <w:jc w:val="center"/>
+              <w:rPr>
+                <w:rFonts w:ascii="Calibri" w:eastAsia="Times New Roman" w:hAnsi="Calibri" w:cs="Calibri"/>
+                <w:color w:val="000000"/>
+                <w:kern w:val="0"/>
+                <w:szCs w:val="22"/>
+                <w:lang w:bidi="ar-SA"/>
+                <w14:ligatures w14:val="none"/>
+              </w:rPr>
+            </w:pPr>
+            <w:r>
+              <w:rPr>
+                <w:rFonts w:ascii="Calibri" w:eastAsia="Times New Roman" w:hAnsi="Calibri" w:cs="Calibri"/>
+                <w:color w:val="000000"/>
+                <w:kern w:val="0"/>
+                <w:szCs w:val="22"/>
+                <w:lang w:bidi="ar-SA"/>
+                <w14:ligatures w14:val="none"/>
+              </w:rPr>
+              <w:t>Obj of given Type -&gt; (T)</w:t>
+            </w:r>
+          </w:p>
+        </w:tc>
+        <w:tc>
+          <w:tcPr>
+            <w:tcW w:w="2100" w:type="dxa"/>
+            <w:tcBorders>
+              <w:top w:val="nil"/>
+              <w:left w:val="single" w:sz="12" w:space="0" w:color="auto"/>
+              <w:bottom w:val="single" w:sz="4" w:space="0" w:color="auto"/>
+              <w:right w:val="single" w:sz="12" w:space="0" w:color="auto"/>
+            </w:tcBorders>
+            <w:shd w:val="clear" w:color="auto" w:fill="auto"/>
+            <w:noWrap/>
+            <w:vAlign w:val="center"/>
+            <w:hideMark/>
+          </w:tcPr>
+          <w:p>
+            <w:pPr>
+              <w:spacing w:after="0" w:line="240" w:lineRule="auto"/>
+              <w:jc w:val="center"/>
+              <w:rPr>
+                <w:rFonts w:ascii="Calibri" w:eastAsia="Times New Roman" w:hAnsi="Calibri" w:cs="Calibri"/>
+                <w:color w:val="000000"/>
+                <w:kern w:val="0"/>
+                <w:szCs w:val="22"/>
+                <w:lang w:bidi="ar-SA"/>
+                <w14:ligatures w14:val="none"/>
+              </w:rPr>
+            </w:pPr>
+            <w:r>
+              <w:rPr>
+                <w:rFonts w:ascii="Calibri" w:eastAsia="Times New Roman" w:hAnsi="Calibri" w:cs="Calibri"/>
+                <w:color w:val="000000"/>
+                <w:kern w:val="0"/>
+                <w:szCs w:val="22"/>
+                <w:lang w:bidi="ar-SA"/>
+                <w14:ligatures w14:val="none"/>
+              </w:rPr>
+              <w:t>SGT</w:t>
+            </w:r>
+          </w:p>
+        </w:tc>
+      </w:tr>
+      <w:tr>
+        <w:trPr>
+          <w:trHeight w:val="864"/>
+        </w:trPr>
+        <w:tc>
+          <w:tcPr>
+            <w:tcW w:w="1900" w:type="dxa"/>
+            <w:tcBorders>
+              <w:top w:val="nil"/>
+              <w:left w:val="single" w:sz="12" w:space="0" w:color="auto"/>
+              <w:bottom w:val="single" w:sz="4" w:space="0" w:color="auto"/>
+              <w:right w:val="single" w:sz="12" w:space="0" w:color="auto"/>
+            </w:tcBorders>
+            <w:shd w:val="clear" w:color="auto" w:fill="auto"/>
+            <w:vAlign w:val="center"/>
+            <w:hideMark/>
+          </w:tcPr>
+          <w:p>
+            <w:pPr>
+              <w:spacing w:after="0" w:line="240" w:lineRule="auto"/>
+              <w:jc w:val="center"/>
+              <w:rPr>
+                <w:rFonts w:ascii="Calibri" w:eastAsia="Times New Roman" w:hAnsi="Calibri" w:cs="Calibri"/>
+                <w:color w:val="000000"/>
+                <w:kern w:val="0"/>
+                <w:szCs w:val="22"/>
+                <w:lang w:bidi="ar-SA"/>
+                <w14:ligatures w14:val="none"/>
+              </w:rPr>
+            </w:pPr>
+            <w:r>
+              <w:rPr>
+                <w:rFonts w:ascii="Calibri" w:eastAsia="Times New Roman" w:hAnsi="Calibri" w:cs="Calibri"/>
+                <w:color w:val="000000"/>
+                <w:kern w:val="0"/>
+                <w:szCs w:val="22"/>
+                <w:lang w:bidi="ar-SA"/>
+                <w14:ligatures w14:val="none"/>
+              </w:rPr>
+              <w:t>Function&lt;T, R</w:t>
+            </w:r>
+            <w:proofErr w:type="gramStart"/>
+            <w:r>
+              <w:rPr>
+                <w:rFonts w:ascii="Calibri" w:eastAsia="Times New Roman" w:hAnsi="Calibri" w:cs="Calibri"/>
+                <w:color w:val="000000"/>
+                <w:kern w:val="0"/>
+                <w:szCs w:val="22"/>
+                <w:lang w:bidi="ar-SA"/>
+                <w14:ligatures w14:val="none"/>
+              </w:rPr>
+              <w:t>&gt;  T</w:t>
+            </w:r>
+            <w:proofErr w:type="gramEnd"/>
+            <w:r>
+              <w:rPr>
+                <w:rFonts w:ascii="Calibri" w:eastAsia="Times New Roman" w:hAnsi="Calibri" w:cs="Calibri"/>
+                <w:color w:val="000000"/>
+                <w:kern w:val="0"/>
+                <w:szCs w:val="22"/>
+                <w:lang w:bidi="ar-SA"/>
+                <w14:ligatures w14:val="none"/>
+              </w:rPr>
+              <w:t xml:space="preserve"> = input type &amp; R = return type</w:t>
+            </w:r>
+          </w:p>
+        </w:tc>
+        <w:tc>
+          <w:tcPr>
+            <w:tcW w:w="1920" w:type="dxa"/>
+            <w:tcBorders>
+              <w:top w:val="nil"/>
+              <w:left w:val="single" w:sz="12" w:space="0" w:color="auto"/>
+              <w:bottom w:val="single" w:sz="4" w:space="0" w:color="auto"/>
+              <w:right w:val="single" w:sz="12" w:space="0" w:color="auto"/>
+            </w:tcBorders>
+            <w:shd w:val="clear" w:color="auto" w:fill="auto"/>
+            <w:noWrap/>
+            <w:vAlign w:val="center"/>
+            <w:hideMark/>
+          </w:tcPr>
+          <w:p>
+            <w:pPr>
+              <w:spacing w:after="0" w:line="240" w:lineRule="auto"/>
+              <w:jc w:val="center"/>
+              <w:rPr>
+                <w:rFonts w:ascii="Calibri" w:eastAsia="Times New Roman" w:hAnsi="Calibri" w:cs="Calibri"/>
+                <w:color w:val="000000"/>
+                <w:kern w:val="0"/>
+                <w:szCs w:val="22"/>
+                <w:lang w:bidi="ar-SA"/>
+                <w14:ligatures w14:val="none"/>
+              </w:rPr>
+            </w:pPr>
+            <w:r>
+              <w:rPr>
+                <w:rFonts w:ascii="Calibri" w:eastAsia="Times New Roman" w:hAnsi="Calibri" w:cs="Calibri"/>
+                <w:color w:val="000000"/>
+                <w:kern w:val="0"/>
+                <w:szCs w:val="22"/>
+                <w:lang w:bidi="ar-SA"/>
+                <w14:ligatures w14:val="none"/>
+              </w:rPr>
+              <w:t>apply(T t)</w:t>
+            </w:r>
+          </w:p>
+        </w:tc>
+        <w:tc>
+          <w:tcPr>
+            <w:tcW w:w="2390" w:type="dxa"/>
+            <w:tcBorders>
+              <w:top w:val="nil"/>
+              <w:left w:val="single" w:sz="12" w:space="0" w:color="auto"/>
+              <w:bottom w:val="single" w:sz="4" w:space="0" w:color="auto"/>
+              <w:right w:val="single" w:sz="12" w:space="0" w:color="auto"/>
+            </w:tcBorders>
+            <w:shd w:val="clear" w:color="auto" w:fill="auto"/>
+            <w:vAlign w:val="center"/>
+            <w:hideMark/>
+          </w:tcPr>
+          <w:p>
+            <w:pPr>
+              <w:spacing w:after="0" w:line="240" w:lineRule="auto"/>
+              <w:jc w:val="center"/>
+              <w:rPr>
+                <w:rFonts w:ascii="Calibri" w:eastAsia="Times New Roman" w:hAnsi="Calibri" w:cs="Calibri"/>
+                <w:color w:val="000000"/>
+                <w:kern w:val="0"/>
+                <w:szCs w:val="22"/>
+                <w:lang w:bidi="ar-SA"/>
+                <w14:ligatures w14:val="none"/>
+              </w:rPr>
+            </w:pPr>
+            <w:r>
+              <w:rPr>
+                <w:rFonts w:ascii="Calibri" w:eastAsia="Times New Roman" w:hAnsi="Calibri" w:cs="Calibri"/>
+                <w:color w:val="000000"/>
+                <w:kern w:val="0"/>
+                <w:szCs w:val="22"/>
+                <w:lang w:bidi="ar-SA"/>
+                <w14:ligatures w14:val="none"/>
+              </w:rPr>
+              <w:t>Returns given type -&gt; R</w:t>
+            </w:r>
+          </w:p>
+        </w:tc>
+        <w:tc>
+          <w:tcPr>
+            <w:tcW w:w="2100" w:type="dxa"/>
+            <w:tcBorders>
+              <w:top w:val="nil"/>
+              <w:left w:val="single" w:sz="12" w:space="0" w:color="auto"/>
+              <w:bottom w:val="single" w:sz="4" w:space="0" w:color="auto"/>
+              <w:right w:val="single" w:sz="12" w:space="0" w:color="auto"/>
+            </w:tcBorders>
+            <w:shd w:val="clear" w:color="auto" w:fill="auto"/>
+            <w:noWrap/>
+            <w:vAlign w:val="center"/>
+            <w:hideMark/>
+          </w:tcPr>
+          <w:p>
+            <w:pPr>
+              <w:spacing w:after="0" w:line="240" w:lineRule="auto"/>
+              <w:jc w:val="center"/>
+              <w:rPr>
+                <w:rFonts w:ascii="Calibri" w:eastAsia="Times New Roman" w:hAnsi="Calibri" w:cs="Calibri"/>
+                <w:color w:val="000000"/>
+                <w:kern w:val="0"/>
+                <w:szCs w:val="22"/>
+                <w:lang w:bidi="ar-SA"/>
+                <w14:ligatures w14:val="none"/>
+              </w:rPr>
+            </w:pPr>
+            <w:r>
+              <w:rPr>
+                <w:rFonts w:ascii="Calibri" w:eastAsia="Times New Roman" w:hAnsi="Calibri" w:cs="Calibri"/>
+                <w:color w:val="000000"/>
+                <w:kern w:val="0"/>
+                <w:szCs w:val="22"/>
+                <w:lang w:bidi="ar-SA"/>
+                <w14:ligatures w14:val="none"/>
+              </w:rPr>
+              <w:t>FAR</w:t>
+            </w:r>
+          </w:p>
+        </w:tc>
+      </w:tr>
+      <w:tr>
+        <w:trPr>
+          <w:trHeight w:val="288"/>
+        </w:trPr>
+        <w:tc>
+          <w:tcPr>
+            <w:tcW w:w="1900" w:type="dxa"/>
+            <w:tcBorders>
+              <w:top w:val="single" w:sz="4" w:space="0" w:color="auto"/>
+              <w:left w:val="single" w:sz="12" w:space="0" w:color="auto"/>
+              <w:bottom w:val="single" w:sz="4" w:space="0" w:color="auto"/>
+              <w:right w:val="single" w:sz="12" w:space="0" w:color="auto"/>
+            </w:tcBorders>
+            <w:shd w:val="clear" w:color="auto" w:fill="auto"/>
+            <w:noWrap/>
+            <w:vAlign w:val="center"/>
+            <w:hideMark/>
+          </w:tcPr>
+          <w:p>
+            <w:pPr>
+              <w:spacing w:after="0" w:line="240" w:lineRule="auto"/>
+              <w:jc w:val="center"/>
+              <w:rPr>
+                <w:rFonts w:ascii="Calibri" w:eastAsia="Times New Roman" w:hAnsi="Calibri" w:cs="Calibri"/>
+                <w:color w:val="000000"/>
+                <w:kern w:val="0"/>
+                <w:szCs w:val="22"/>
+                <w:lang w:bidi="ar-SA"/>
+                <w14:ligatures w14:val="none"/>
+              </w:rPr>
+            </w:pPr>
+            <w:r>
+              <w:rPr>
+                <w:rFonts w:ascii="Calibri" w:eastAsia="Times New Roman" w:hAnsi="Calibri" w:cs="Calibri"/>
+                <w:color w:val="000000"/>
+                <w:kern w:val="0"/>
+                <w:szCs w:val="22"/>
+                <w:lang w:bidi="ar-SA"/>
+                <w14:ligatures w14:val="none"/>
+              </w:rPr>
+              <w:t>Consumer&lt;T&gt;</w:t>
+            </w:r>
+          </w:p>
+        </w:tc>
+        <w:tc>
+          <w:tcPr>
+            <w:tcW w:w="1920" w:type="dxa"/>
+            <w:tcBorders>
+              <w:top w:val="single" w:sz="4" w:space="0" w:color="auto"/>
+              <w:left w:val="single" w:sz="12" w:space="0" w:color="auto"/>
+              <w:bottom w:val="single" w:sz="4" w:space="0" w:color="auto"/>
+              <w:right w:val="single" w:sz="12" w:space="0" w:color="auto"/>
+            </w:tcBorders>
+            <w:shd w:val="clear" w:color="auto" w:fill="auto"/>
+            <w:noWrap/>
+            <w:vAlign w:val="center"/>
+            <w:hideMark/>
+          </w:tcPr>
+          <w:p>
+            <w:pPr>
+              <w:spacing w:after="0" w:line="240" w:lineRule="auto"/>
+              <w:jc w:val="center"/>
+              <w:rPr>
+                <w:rFonts w:ascii="Calibri" w:eastAsia="Times New Roman" w:hAnsi="Calibri" w:cs="Calibri"/>
+                <w:color w:val="000000"/>
+                <w:kern w:val="0"/>
+                <w:szCs w:val="22"/>
+                <w:lang w:bidi="ar-SA"/>
+                <w14:ligatures w14:val="none"/>
+              </w:rPr>
+            </w:pPr>
+            <w:r>
+              <w:rPr>
+                <w:rFonts w:ascii="Calibri" w:eastAsia="Times New Roman" w:hAnsi="Calibri" w:cs="Calibri"/>
+                <w:color w:val="000000"/>
+                <w:kern w:val="0"/>
+                <w:szCs w:val="22"/>
+                <w:lang w:bidi="ar-SA"/>
+                <w14:ligatures w14:val="none"/>
+              </w:rPr>
+              <w:t>accept(T t)</w:t>
+            </w:r>
+          </w:p>
+        </w:tc>
+        <w:tc>
+          <w:tcPr>
+            <w:tcW w:w="2390" w:type="dxa"/>
+            <w:tcBorders>
+              <w:top w:val="single" w:sz="4" w:space="0" w:color="auto"/>
+              <w:left w:val="single" w:sz="12" w:space="0" w:color="auto"/>
+              <w:bottom w:val="single" w:sz="4" w:space="0" w:color="auto"/>
+              <w:right w:val="single" w:sz="12" w:space="0" w:color="auto"/>
+            </w:tcBorders>
+            <w:shd w:val="clear" w:color="auto" w:fill="auto"/>
+            <w:vAlign w:val="center"/>
+            <w:hideMark/>
+          </w:tcPr>
+          <w:p>
+            <w:pPr>
+              <w:spacing w:after="0" w:line="240" w:lineRule="auto"/>
+              <w:jc w:val="center"/>
+              <w:rPr>
+                <w:rFonts w:ascii="Calibri" w:eastAsia="Times New Roman" w:hAnsi="Calibri" w:cs="Calibri"/>
+                <w:color w:val="000000"/>
+                <w:kern w:val="0"/>
+                <w:szCs w:val="22"/>
+                <w:lang w:bidi="ar-SA"/>
+                <w14:ligatures w14:val="none"/>
+              </w:rPr>
+            </w:pPr>
+            <w:r>
+              <w:rPr>
+                <w:rFonts w:ascii="Calibri" w:eastAsia="Times New Roman" w:hAnsi="Calibri" w:cs="Calibri"/>
+                <w:color w:val="000000"/>
+                <w:kern w:val="0"/>
+                <w:szCs w:val="22"/>
+                <w:lang w:bidi="ar-SA"/>
+                <w14:ligatures w14:val="none"/>
+              </w:rPr>
+              <w:t>void -&gt; No Return type</w:t>
+            </w:r>
+          </w:p>
+        </w:tc>
+        <w:tc>
+          <w:tcPr>
+            <w:tcW w:w="2100" w:type="dxa"/>
+            <w:tcBorders>
+              <w:top w:val="single" w:sz="4" w:space="0" w:color="auto"/>
+              <w:left w:val="single" w:sz="12" w:space="0" w:color="auto"/>
+              <w:bottom w:val="single" w:sz="4" w:space="0" w:color="auto"/>
+              <w:right w:val="single" w:sz="12" w:space="0" w:color="auto"/>
+            </w:tcBorders>
+            <w:shd w:val="clear" w:color="auto" w:fill="auto"/>
+            <w:noWrap/>
+            <w:vAlign w:val="center"/>
+            <w:hideMark/>
+          </w:tcPr>
+          <w:p>
+            <w:pPr>
+              <w:spacing w:after="0" w:line="240" w:lineRule="auto"/>
+              <w:jc w:val="center"/>
+              <w:rPr>
+                <w:rFonts w:ascii="Calibri" w:eastAsia="Times New Roman" w:hAnsi="Calibri" w:cs="Calibri"/>
+                <w:color w:val="000000"/>
+                <w:kern w:val="0"/>
+                <w:szCs w:val="22"/>
+                <w:lang w:bidi="ar-SA"/>
+                <w14:ligatures w14:val="none"/>
+              </w:rPr>
+            </w:pPr>
+            <w:r>
+              <w:rPr>
+                <w:rFonts w:ascii="Calibri" w:eastAsia="Times New Roman" w:hAnsi="Calibri" w:cs="Calibri"/>
+                <w:color w:val="000000"/>
+                <w:kern w:val="0"/>
+                <w:szCs w:val="22"/>
+                <w:lang w:bidi="ar-SA"/>
+                <w14:ligatures w14:val="none"/>
+              </w:rPr>
+              <w:t>CAN</w:t>
+            </w:r>
+          </w:p>
+        </w:tc>
+      </w:tr>
+      <w:tr>
+        <w:trPr>
+          <w:trHeight w:val="288"/>
+        </w:trPr>
+        <w:tc>
+          <w:tcPr>
+            <w:tcW w:w="1900" w:type="dxa"/>
+            <w:tcBorders>
+              <w:top w:val="single" w:sz="4" w:space="0" w:color="auto"/>
+              <w:left w:val="single" w:sz="12" w:space="0" w:color="auto"/>
+              <w:bottom w:val="single" w:sz="12" w:space="0" w:color="auto"/>
+              <w:right w:val="single" w:sz="12" w:space="0" w:color="auto"/>
+            </w:tcBorders>
+            <w:shd w:val="clear" w:color="auto" w:fill="auto"/>
+            <w:noWrap/>
+            <w:vAlign w:val="center"/>
+          </w:tcPr>
+          <w:p>
+            <w:pPr>
+              <w:spacing w:after="0" w:line="240" w:lineRule="auto"/>
+              <w:jc w:val="center"/>
+              <w:rPr>
+                <w:rFonts w:ascii="Calibri" w:eastAsia="Times New Roman" w:hAnsi="Calibri" w:cs="Calibri"/>
+                <w:color w:val="000000"/>
+                <w:kern w:val="0"/>
+                <w:szCs w:val="22"/>
+                <w:lang w:bidi="ar-SA"/>
+                <w14:ligatures w14:val="none"/>
+              </w:rPr>
+            </w:pPr>
+          </w:p>
+        </w:tc>
+        <w:tc>
+          <w:tcPr>
+            <w:tcW w:w="1920" w:type="dxa"/>
+            <w:tcBorders>
+              <w:top w:val="single" w:sz="4" w:space="0" w:color="auto"/>
+              <w:left w:val="single" w:sz="12" w:space="0" w:color="auto"/>
+              <w:bottom w:val="single" w:sz="12" w:space="0" w:color="auto"/>
+              <w:right w:val="single" w:sz="12" w:space="0" w:color="auto"/>
+            </w:tcBorders>
+            <w:shd w:val="clear" w:color="auto" w:fill="auto"/>
+            <w:noWrap/>
+            <w:vAlign w:val="center"/>
+          </w:tcPr>
+          <w:p>
+            <w:pPr>
+              <w:spacing w:after="0" w:line="240" w:lineRule="auto"/>
+              <w:jc w:val="center"/>
+              <w:rPr>
+                <w:rFonts w:ascii="Calibri" w:eastAsia="Times New Roman" w:hAnsi="Calibri" w:cs="Calibri"/>
+                <w:color w:val="000000"/>
+                <w:kern w:val="0"/>
+                <w:szCs w:val="22"/>
+                <w:lang w:bidi="ar-SA"/>
+                <w14:ligatures w14:val="none"/>
+              </w:rPr>
+            </w:pPr>
+          </w:p>
+        </w:tc>
+        <w:tc>
+          <w:tcPr>
+            <w:tcW w:w="2390" w:type="dxa"/>
+            <w:tcBorders>
+              <w:top w:val="single" w:sz="4" w:space="0" w:color="auto"/>
+              <w:left w:val="single" w:sz="12" w:space="0" w:color="auto"/>
+              <w:bottom w:val="single" w:sz="12" w:space="0" w:color="auto"/>
+              <w:right w:val="single" w:sz="12" w:space="0" w:color="auto"/>
+            </w:tcBorders>
+            <w:shd w:val="clear" w:color="auto" w:fill="auto"/>
+            <w:vAlign w:val="center"/>
+          </w:tcPr>
+          <w:p>
+            <w:pPr>
+              <w:spacing w:after="0" w:line="240" w:lineRule="auto"/>
+              <w:jc w:val="center"/>
+              <w:rPr>
+                <w:rFonts w:ascii="Calibri" w:eastAsia="Times New Roman" w:hAnsi="Calibri" w:cs="Calibri"/>
+                <w:color w:val="000000"/>
+                <w:kern w:val="0"/>
+                <w:szCs w:val="22"/>
+                <w:lang w:bidi="ar-SA"/>
+                <w14:ligatures w14:val="none"/>
+              </w:rPr>
+            </w:pPr>
+          </w:p>
+        </w:tc>
+        <w:tc>
+          <w:tcPr>
+            <w:tcW w:w="2100" w:type="dxa"/>
+            <w:tcBorders>
+              <w:top w:val="single" w:sz="4" w:space="0" w:color="auto"/>
+              <w:left w:val="single" w:sz="12" w:space="0" w:color="auto"/>
+              <w:bottom w:val="single" w:sz="12" w:space="0" w:color="auto"/>
+              <w:right w:val="single" w:sz="12" w:space="0" w:color="auto"/>
+            </w:tcBorders>
+            <w:shd w:val="clear" w:color="auto" w:fill="auto"/>
+            <w:noWrap/>
+            <w:vAlign w:val="center"/>
+          </w:tcPr>
+          <w:p>
+            <w:pPr>
+              <w:spacing w:after="0" w:line="240" w:lineRule="auto"/>
+              <w:jc w:val="center"/>
+              <w:rPr>
+                <w:rFonts w:ascii="Calibri" w:eastAsia="Times New Roman" w:hAnsi="Calibri" w:cs="Calibri"/>
+                <w:color w:val="000000"/>
+                <w:kern w:val="0"/>
+                <w:szCs w:val="22"/>
+                <w:lang w:bidi="ar-SA"/>
+                <w14:ligatures w14:val="none"/>
+              </w:rPr>
+            </w:pPr>
+          </w:p>
+        </w:tc>
+      </w:tr>
+    </w:tbl>
+    <w:p>
+      <w:pPr>
+        <w:pStyle w:val="ListParagraph"/>
+        <w:numPr>
+          <w:ilvl w:val="0"/>
+          <w:numId w:val="3"/>
+        </w:numPr>
+        <w:rPr>
+          <w:rFonts w:ascii="Times New Roman" w:hAnsi="Times New Roman" w:cs="Times New Roman"/>
+          <w:sz w:val="28"/>
+          <w:szCs w:val="24"/>
+        </w:rPr>
+      </w:pPr>
     </w:p>
     <w:p>
       <w:pPr>

</xml_diff>

<commit_message>
adding changes on 7th may 2024
</commit_message>
<xml_diff>
--- a/JAVA_1.8_CONCEPTS_BY_JAVA_BRAINS.docx
+++ b/JAVA_1.8_CONCEPTS_BY_JAVA_BRAINS.docx
@@ -194,7 +194,15 @@
           <w:sz w:val="28"/>
           <w:szCs w:val="24"/>
         </w:rPr>
-        <w:t xml:space="preserve">introducing functional programing language in java, by adopting a concept called </w:t>
+        <w:t xml:space="preserve">introducing functional </w:t>
+      </w:r>
+      <w:r>
+        <w:rPr>
+          <w:rFonts w:ascii="Times New Roman" w:hAnsi="Times New Roman" w:cs="Times New Roman"/>
+          <w:sz w:val="28"/>
+          <w:szCs w:val="24"/>
+        </w:rPr>
+        <w:t xml:space="preserve">programing language in java, by adopting a concept called </w:t>
       </w:r>
       <w:r>
         <w:rPr>
@@ -212,15 +220,7 @@
           <w:sz w:val="28"/>
           <w:szCs w:val="24"/>
         </w:rPr>
-        <w:t xml:space="preserve"> </w:t>
-      </w:r>
-      <w:r>
-        <w:rPr>
-          <w:rFonts w:ascii="Times New Roman" w:hAnsi="Times New Roman" w:cs="Times New Roman"/>
-          <w:sz w:val="28"/>
-          <w:szCs w:val="24"/>
-        </w:rPr>
-        <w:t>in</w:t>
+        <w:t xml:space="preserve"> in</w:t>
       </w:r>
       <w:r>
         <w:rPr>
@@ -667,29 +667,7 @@
           <w:szCs w:val="24"/>
           <w14:ligatures w14:val="none"/>
         </w:rPr>
-        <w:t xml:space="preserve"> Date and Time API or </w:t>
-      </w:r>
-      <w:proofErr w:type="spellStart"/>
-      <w:r>
-        <w:rPr>
-          <w:rFonts w:ascii="Times New Roman" w:hAnsi="Times New Roman" w:cs="Times New Roman"/>
-          <w:kern w:val="0"/>
-          <w:sz w:val="28"/>
-          <w:szCs w:val="24"/>
-          <w14:ligatures w14:val="none"/>
-        </w:rPr>
-        <w:t>Joda</w:t>
-      </w:r>
-      <w:proofErr w:type="spellEnd"/>
-      <w:r>
-        <w:rPr>
-          <w:rFonts w:ascii="Times New Roman" w:hAnsi="Times New Roman" w:cs="Times New Roman"/>
-          <w:kern w:val="0"/>
-          <w:sz w:val="28"/>
-          <w:szCs w:val="24"/>
-          <w14:ligatures w14:val="none"/>
-        </w:rPr>
-        <w:t xml:space="preserve"> API</w:t>
+        <w:t xml:space="preserve"> Date and Time API or Joda API</w:t>
       </w:r>
       <w:r>
         <w:rPr>

</xml_diff>

<commit_message>
commit changes on 13th July
</commit_message>
<xml_diff>
--- a/JAVA_1.8_CONCEPTS_BY_JAVA_BRAINS.docx
+++ b/JAVA_1.8_CONCEPTS_BY_JAVA_BRAINS.docx
@@ -542,18 +542,8 @@
           <w:szCs w:val="24"/>
         </w:rPr>
         <w:tab/>
-        <w:t xml:space="preserve">- </w:t>
-      </w:r>
-      <w:proofErr w:type="spellStart"/>
-      <w:r>
-        <w:rPr>
-          <w:rFonts w:ascii="Times New Roman" w:hAnsi="Times New Roman" w:cs="Times New Roman"/>
-          <w:sz w:val="28"/>
-          <w:szCs w:val="24"/>
-        </w:rPr>
-        <w:t>DoublePredicate</w:t>
-      </w:r>
-      <w:proofErr w:type="spellEnd"/>
+        <w:t>- DoublePredicate</w:t>
+      </w:r>
       <w:r>
         <w:rPr>
           <w:rFonts w:ascii="Times New Roman" w:hAnsi="Times New Roman" w:cs="Times New Roman"/>
@@ -602,18 +592,8 @@
           <w:szCs w:val="24"/>
         </w:rPr>
         <w:tab/>
-        <w:t xml:space="preserve">- </w:t>
-      </w:r>
-      <w:proofErr w:type="spellStart"/>
-      <w:r>
-        <w:rPr>
-          <w:rFonts w:ascii="Times New Roman" w:hAnsi="Times New Roman" w:cs="Times New Roman"/>
-          <w:sz w:val="28"/>
-          <w:szCs w:val="24"/>
-        </w:rPr>
-        <w:t>DoubleFunction</w:t>
-      </w:r>
-      <w:proofErr w:type="spellEnd"/>
+        <w:t>- DoubleFunction</w:t>
+      </w:r>
       <w:r>
         <w:rPr>
           <w:rFonts w:ascii="Times New Roman" w:hAnsi="Times New Roman" w:cs="Times New Roman"/>
@@ -654,18 +634,8 @@
           <w:szCs w:val="24"/>
         </w:rPr>
         <w:tab/>
-        <w:t xml:space="preserve">- </w:t>
-      </w:r>
-      <w:proofErr w:type="spellStart"/>
-      <w:r>
-        <w:rPr>
-          <w:rFonts w:ascii="Times New Roman" w:hAnsi="Times New Roman" w:cs="Times New Roman"/>
-          <w:sz w:val="28"/>
-          <w:szCs w:val="24"/>
-        </w:rPr>
-        <w:t>DoubleConsumer</w:t>
-      </w:r>
-      <w:proofErr w:type="spellEnd"/>
+        <w:t>- DoubleConsumer</w:t>
+      </w:r>
       <w:r>
         <w:rPr>
           <w:rFonts w:ascii="Times New Roman" w:hAnsi="Times New Roman" w:cs="Times New Roman"/>
@@ -714,37 +684,17 @@
           <w:szCs w:val="24"/>
         </w:rPr>
         <w:tab/>
-        <w:t xml:space="preserve">- </w:t>
-      </w:r>
-      <w:proofErr w:type="spellStart"/>
-      <w:r>
-        <w:rPr>
-          <w:rFonts w:ascii="Times New Roman" w:hAnsi="Times New Roman" w:cs="Times New Roman"/>
-          <w:sz w:val="28"/>
-          <w:szCs w:val="24"/>
-        </w:rPr>
-        <w:t>DoubleSupplier</w:t>
-      </w:r>
-      <w:proofErr w:type="spellEnd"/>
-      <w:r>
-        <w:rPr>
-          <w:rFonts w:ascii="Times New Roman" w:hAnsi="Times New Roman" w:cs="Times New Roman"/>
-          <w:sz w:val="28"/>
-          <w:szCs w:val="24"/>
-        </w:rPr>
-        <w:br/>
-        <w:t xml:space="preserve">    - </w:t>
-      </w:r>
-      <w:proofErr w:type="spellStart"/>
-      <w:r>
-        <w:rPr>
-          <w:rFonts w:ascii="Times New Roman" w:hAnsi="Times New Roman" w:cs="Times New Roman"/>
-          <w:sz w:val="28"/>
-          <w:szCs w:val="24"/>
-        </w:rPr>
-        <w:t>BiPredicate</w:t>
-      </w:r>
-      <w:proofErr w:type="spellEnd"/>
+        <w:t>- DoubleSupplier</w:t>
+      </w:r>
+      <w:r>
+        <w:rPr>
+          <w:rFonts w:ascii="Times New Roman" w:hAnsi="Times New Roman" w:cs="Times New Roman"/>
+          <w:sz w:val="28"/>
+          <w:szCs w:val="24"/>
+        </w:rPr>
+        <w:br/>
+        <w:t xml:space="preserve">    - BiPredicate</w:t>
+      </w:r>
       <w:r>
         <w:rPr>
           <w:rFonts w:ascii="Times New Roman" w:hAnsi="Times New Roman" w:cs="Times New Roman"/>
@@ -761,9 +711,8 @@
           <w:szCs w:val="24"/>
           <w14:ligatures w14:val="none"/>
         </w:rPr>
-        <w:t xml:space="preserve">    - </w:t>
-      </w:r>
-      <w:proofErr w:type="spellStart"/>
+        <w:t xml:space="preserve">    - BiFunction</w:t>
+      </w:r>
       <w:r>
         <w:rPr>
           <w:rFonts w:ascii="Times New Roman" w:hAnsi="Times New Roman" w:cs="Times New Roman"/>
@@ -772,9 +721,9 @@
           <w:szCs w:val="24"/>
           <w14:ligatures w14:val="none"/>
         </w:rPr>
-        <w:t>BiFunction</w:t>
-      </w:r>
-      <w:proofErr w:type="spellEnd"/>
+        <w:br/>
+        <w:t xml:space="preserve">    - BiConsumer</w:t>
+      </w:r>
       <w:r>
         <w:rPr>
           <w:rFonts w:ascii="Times New Roman" w:hAnsi="Times New Roman" w:cs="Times New Roman"/>
@@ -784,48 +733,15 @@
           <w14:ligatures w14:val="none"/>
         </w:rPr>
         <w:br/>
-        <w:t xml:space="preserve">    - </w:t>
-      </w:r>
-      <w:proofErr w:type="spellStart"/>
-      <w:r>
-        <w:rPr>
-          <w:rFonts w:ascii="Times New Roman" w:hAnsi="Times New Roman" w:cs="Times New Roman"/>
-          <w:kern w:val="0"/>
-          <w:sz w:val="28"/>
-          <w:szCs w:val="24"/>
-          <w14:ligatures w14:val="none"/>
-        </w:rPr>
-        <w:t>BiConsumer</w:t>
-      </w:r>
-      <w:proofErr w:type="spellEnd"/>
-      <w:r>
-        <w:rPr>
-          <w:rFonts w:ascii="Times New Roman" w:hAnsi="Times New Roman" w:cs="Times New Roman"/>
-          <w:kern w:val="0"/>
-          <w:sz w:val="28"/>
-          <w:szCs w:val="24"/>
-          <w14:ligatures w14:val="none"/>
-        </w:rPr>
-        <w:br/>
-      </w:r>
-      <w:r>
-        <w:rPr>
-          <w:rFonts w:ascii="Times New Roman" w:hAnsi="Times New Roman" w:cs="Times New Roman"/>
-          <w:sz w:val="28"/>
-          <w:szCs w:val="24"/>
-        </w:rPr>
-        <w:t xml:space="preserve">    - </w:t>
-      </w:r>
-      <w:proofErr w:type="spellStart"/>
-      <w:r>
-        <w:rPr>
-          <w:rFonts w:ascii="Times New Roman" w:hAnsi="Times New Roman" w:cs="Times New Roman"/>
-          <w:sz w:val="28"/>
-          <w:szCs w:val="24"/>
-        </w:rPr>
-        <w:t>BiSupplier</w:t>
-      </w:r>
-      <w:proofErr w:type="spellEnd"/>
+      </w:r>
+      <w:r>
+        <w:rPr>
+          <w:rFonts w:ascii="Times New Roman" w:hAnsi="Times New Roman" w:cs="Times New Roman"/>
+          <w:sz w:val="28"/>
+          <w:szCs w:val="24"/>
+        </w:rPr>
+        <w:t xml:space="preserve">    - BiSupplier</w:t>
+      </w:r>
       <w:r>
         <w:rPr>
           <w:rFonts w:ascii="Times New Roman" w:hAnsi="Times New Roman" w:cs="Times New Roman"/>
@@ -983,20 +899,8 @@
           <w:sz w:val="28"/>
           <w:szCs w:val="24"/>
         </w:rPr>
-        <w:t xml:space="preserve">Which has NO Name, NO Modifiers, NO </w:t>
-      </w:r>
-      <w:proofErr w:type="spellStart"/>
-      <w:r>
-        <w:rPr>
-          <w:rFonts w:ascii="Times New Roman" w:hAnsi="Times New Roman" w:cs="Times New Roman"/>
-          <w:b/>
-          <w:bCs/>
-          <w:sz w:val="28"/>
-          <w:szCs w:val="24"/>
-        </w:rPr>
-        <w:t>ReturnType</w:t>
-      </w:r>
-      <w:proofErr w:type="spellEnd"/>
+        <w:t>Which has NO Name, NO Modifiers, NO ReturnType</w:t>
+      </w:r>
       <w:r>
         <w:rPr>
           <w:rFonts w:ascii="Times New Roman" w:hAnsi="Times New Roman" w:cs="Times New Roman"/>
@@ -1777,25 +1681,7 @@
           <w:sz w:val="28"/>
           <w:szCs w:val="24"/>
         </w:rPr>
-        <w:t xml:space="preserve">, It will reduce the Developers efforts by </w:t>
-      </w:r>
-      <w:proofErr w:type="spellStart"/>
-      <w:r>
-        <w:rPr>
-          <w:rFonts w:ascii="Times New Roman" w:hAnsi="Times New Roman" w:cs="Times New Roman"/>
-          <w:sz w:val="28"/>
-          <w:szCs w:val="24"/>
-        </w:rPr>
-        <w:t>conciseing</w:t>
-      </w:r>
-      <w:proofErr w:type="spellEnd"/>
-      <w:r>
-        <w:rPr>
-          <w:rFonts w:ascii="Times New Roman" w:hAnsi="Times New Roman" w:cs="Times New Roman"/>
-          <w:sz w:val="28"/>
-          <w:szCs w:val="24"/>
-        </w:rPr>
-        <w:t xml:space="preserve"> (reducing the lines of code) the code. And it increases the readability of a code. </w:t>
+        <w:t xml:space="preserve">, It will reduce the Developers efforts by conciseing (reducing the lines of code) the code. And it increases the readability of a code. </w:t>
       </w:r>
       <w:r>
         <w:rPr>
@@ -2940,7 +2826,6 @@
                 <w14:ligatures w14:val="none"/>
               </w:rPr>
             </w:pPr>
-            <w:proofErr w:type="spellStart"/>
             <w:r>
               <w:rPr>
                 <w:rFonts w:ascii="Calibri" w:eastAsia="Times New Roman" w:hAnsi="Calibri" w:cs="Calibri"/>
@@ -2952,21 +2837,7 @@
                 <w:lang w:bidi="ar-SA"/>
                 <w14:ligatures w14:val="none"/>
               </w:rPr>
-              <w:t>ShortCut</w:t>
-            </w:r>
-            <w:proofErr w:type="spellEnd"/>
-            <w:r>
-              <w:rPr>
-                <w:rFonts w:ascii="Calibri" w:eastAsia="Times New Roman" w:hAnsi="Calibri" w:cs="Calibri"/>
-                <w:b/>
-                <w:bCs/>
-                <w:color w:val="000000"/>
-                <w:kern w:val="0"/>
-                <w:szCs w:val="22"/>
-                <w:lang w:bidi="ar-SA"/>
-                <w14:ligatures w14:val="none"/>
-              </w:rPr>
-              <w:t xml:space="preserve"> to remember</w:t>
+              <w:t>ShortCut to remember</w:t>
             </w:r>
           </w:p>
         </w:tc>
@@ -3042,7 +2913,6 @@
                 <w14:ligatures w14:val="none"/>
               </w:rPr>
             </w:pPr>
-            <w:proofErr w:type="spellStart"/>
             <w:r>
               <w:rPr>
                 <w:rFonts w:ascii="Calibri" w:eastAsia="Times New Roman" w:hAnsi="Calibri" w:cs="Calibri"/>
@@ -3052,19 +2922,7 @@
                 <w:lang w:bidi="ar-SA"/>
                 <w14:ligatures w14:val="none"/>
               </w:rPr>
-              <w:t>boolean</w:t>
-            </w:r>
-            <w:proofErr w:type="spellEnd"/>
-            <w:r>
-              <w:rPr>
-                <w:rFonts w:ascii="Calibri" w:eastAsia="Times New Roman" w:hAnsi="Calibri" w:cs="Calibri"/>
-                <w:color w:val="000000"/>
-                <w:kern w:val="0"/>
-                <w:szCs w:val="22"/>
-                <w:lang w:bidi="ar-SA"/>
-                <w14:ligatures w14:val="none"/>
-              </w:rPr>
-              <w:t xml:space="preserve"> </w:t>
+              <w:t xml:space="preserve">boolean </w:t>
             </w:r>
             <w:r>
               <w:rPr>
@@ -3913,6 +3771,7 @@
       <w:r>
         <w:rPr>
           <w:rFonts w:ascii="Times New Roman" w:hAnsi="Times New Roman" w:cs="Times New Roman"/>
+          <w:noProof/>
           <w:sz w:val="28"/>
           <w:szCs w:val="24"/>
         </w:rPr>
@@ -4019,6 +3878,7 @@
       <w:r>
         <w:rPr>
           <w:rFonts w:ascii="Times New Roman" w:hAnsi="Times New Roman" w:cs="Times New Roman"/>
+          <w:noProof/>
           <w:sz w:val="28"/>
           <w:szCs w:val="24"/>
         </w:rPr>
@@ -4111,6 +3971,7 @@
       <w:r>
         <w:rPr>
           <w:rFonts w:ascii="Times New Roman" w:hAnsi="Times New Roman" w:cs="Times New Roman"/>
+          <w:noProof/>
           <w:sz w:val="28"/>
           <w:szCs w:val="24"/>
         </w:rPr>
@@ -4250,17 +4111,319 @@
           <w:szCs w:val="24"/>
         </w:rPr>
         <w:br/>
-      </w:r>
-      <w:proofErr w:type="spellStart"/>
-      <w:r>
-        <w:rPr>
-          <w:rFonts w:ascii="Times New Roman" w:hAnsi="Times New Roman" w:cs="Times New Roman"/>
-          <w:sz w:val="28"/>
-          <w:szCs w:val="24"/>
-        </w:rPr>
-        <w:t>Class_Name</w:t>
-      </w:r>
-      <w:proofErr w:type="spellEnd"/>
+        <w:t xml:space="preserve">Class_Name </w:t>
+      </w:r>
+      <w:r>
+        <w:rPr>
+          <w:rFonts w:ascii="Times New Roman" w:hAnsi="Times New Roman" w:cs="Times New Roman"/>
+          <w:b/>
+          <w:bCs/>
+          <w:sz w:val="28"/>
+          <w:szCs w:val="24"/>
+        </w:rPr>
+        <w:t>: :</w:t>
+      </w:r>
+      <w:r>
+        <w:rPr>
+          <w:rFonts w:ascii="Times New Roman" w:hAnsi="Times New Roman" w:cs="Times New Roman"/>
+          <w:sz w:val="28"/>
+          <w:szCs w:val="24"/>
+        </w:rPr>
+        <w:t xml:space="preserve"> Static_Method_Name</w:t>
+      </w:r>
+      <w:r>
+        <w:rPr>
+          <w:rFonts w:ascii="Times New Roman" w:hAnsi="Times New Roman" w:cs="Times New Roman"/>
+          <w:sz w:val="28"/>
+          <w:szCs w:val="24"/>
+        </w:rPr>
+        <w:br/>
+      </w:r>
+      <w:r>
+        <w:rPr>
+          <w:rFonts w:ascii="Times New Roman" w:hAnsi="Times New Roman" w:cs="Times New Roman"/>
+          <w:sz w:val="28"/>
+          <w:szCs w:val="24"/>
+        </w:rPr>
+        <w:br/>
+      </w:r>
+      <w:bookmarkStart w:id="0" w:name="_Hlk168615670"/>
+      <w:r>
+        <w:rPr>
+          <w:rFonts w:ascii="Times New Roman" w:hAnsi="Times New Roman" w:cs="Times New Roman"/>
+          <w:b/>
+          <w:bCs/>
+          <w:sz w:val="28"/>
+          <w:szCs w:val="24"/>
+          <w:u w:val="single"/>
+        </w:rPr>
+        <w:t xml:space="preserve">Syntax For </w:t>
+      </w:r>
+      <w:r>
+        <w:rPr>
+          <w:rFonts w:ascii="Times New Roman" w:hAnsi="Times New Roman" w:cs="Times New Roman"/>
+          <w:b/>
+          <w:bCs/>
+          <w:sz w:val="28"/>
+          <w:szCs w:val="24"/>
+          <w:u w:val="single"/>
+        </w:rPr>
+        <w:t>Non-</w:t>
+      </w:r>
+      <w:r>
+        <w:rPr>
+          <w:rFonts w:ascii="Times New Roman" w:hAnsi="Times New Roman" w:cs="Times New Roman"/>
+          <w:b/>
+          <w:bCs/>
+          <w:sz w:val="28"/>
+          <w:szCs w:val="24"/>
+          <w:u w:val="single"/>
+        </w:rPr>
+        <w:t>Static method</w:t>
+      </w:r>
+      <w:r>
+        <w:rPr>
+          <w:rFonts w:ascii="Times New Roman" w:hAnsi="Times New Roman" w:cs="Times New Roman"/>
+          <w:b/>
+          <w:bCs/>
+          <w:sz w:val="28"/>
+          <w:szCs w:val="24"/>
+          <w:u w:val="single"/>
+        </w:rPr>
+        <w:t xml:space="preserve"> Reference</w:t>
+      </w:r>
+      <w:r>
+        <w:rPr>
+          <w:rFonts w:ascii="Times New Roman" w:hAnsi="Times New Roman" w:cs="Times New Roman"/>
+          <w:b/>
+          <w:bCs/>
+          <w:sz w:val="28"/>
+          <w:szCs w:val="24"/>
+          <w:u w:val="single"/>
+        </w:rPr>
+        <w:t>:-</w:t>
+      </w:r>
+      <w:r>
+        <w:rPr>
+          <w:rFonts w:ascii="Times New Roman" w:hAnsi="Times New Roman" w:cs="Times New Roman"/>
+          <w:sz w:val="28"/>
+          <w:szCs w:val="24"/>
+        </w:rPr>
+        <w:br/>
+        <w:t xml:space="preserve">Object_Reference </w:t>
+      </w:r>
+      <w:r>
+        <w:rPr>
+          <w:rFonts w:ascii="Times New Roman" w:hAnsi="Times New Roman" w:cs="Times New Roman"/>
+          <w:b/>
+          <w:bCs/>
+          <w:sz w:val="28"/>
+          <w:szCs w:val="24"/>
+        </w:rPr>
+        <w:t>: :</w:t>
+      </w:r>
+      <w:r>
+        <w:rPr>
+          <w:rFonts w:ascii="Times New Roman" w:hAnsi="Times New Roman" w:cs="Times New Roman"/>
+          <w:sz w:val="28"/>
+          <w:szCs w:val="24"/>
+        </w:rPr>
+        <w:t xml:space="preserve"> Non_Static_Method_Name</w:t>
+      </w:r>
+      <w:bookmarkEnd w:id="0"/>
+      <w:r>
+        <w:rPr>
+          <w:rFonts w:ascii="Times New Roman" w:hAnsi="Times New Roman" w:cs="Times New Roman"/>
+          <w:sz w:val="28"/>
+          <w:szCs w:val="24"/>
+        </w:rPr>
+        <w:br/>
+      </w:r>
+      <w:r>
+        <w:rPr>
+          <w:rFonts w:ascii="Times New Roman" w:hAnsi="Times New Roman" w:cs="Times New Roman"/>
+          <w:sz w:val="28"/>
+          <w:szCs w:val="24"/>
+        </w:rPr>
+        <w:br/>
+      </w:r>
+      <w:r>
+        <w:rPr>
+          <w:rFonts w:ascii="Times New Roman" w:hAnsi="Times New Roman" w:cs="Times New Roman"/>
+          <w:b/>
+          <w:bCs/>
+          <w:sz w:val="28"/>
+          <w:szCs w:val="24"/>
+          <w:u w:val="single"/>
+        </w:rPr>
+        <w:t xml:space="preserve">Syntax For </w:t>
+      </w:r>
+      <w:r>
+        <w:rPr>
+          <w:rFonts w:ascii="Times New Roman" w:hAnsi="Times New Roman" w:cs="Times New Roman"/>
+          <w:b/>
+          <w:bCs/>
+          <w:sz w:val="28"/>
+          <w:szCs w:val="24"/>
+          <w:u w:val="single"/>
+        </w:rPr>
+        <w:t>Constructor Reference</w:t>
+      </w:r>
+      <w:r>
+        <w:rPr>
+          <w:rFonts w:ascii="Times New Roman" w:hAnsi="Times New Roman" w:cs="Times New Roman"/>
+          <w:b/>
+          <w:bCs/>
+          <w:sz w:val="28"/>
+          <w:szCs w:val="24"/>
+          <w:u w:val="single"/>
+        </w:rPr>
+        <w:t>:-</w:t>
+      </w:r>
+      <w:r>
+        <w:rPr>
+          <w:rFonts w:ascii="Times New Roman" w:hAnsi="Times New Roman" w:cs="Times New Roman"/>
+          <w:sz w:val="28"/>
+          <w:szCs w:val="24"/>
+        </w:rPr>
+        <w:br/>
+        <w:t xml:space="preserve">Class_Name </w:t>
+      </w:r>
+      <w:r>
+        <w:rPr>
+          <w:rFonts w:ascii="Times New Roman" w:hAnsi="Times New Roman" w:cs="Times New Roman"/>
+          <w:b/>
+          <w:bCs/>
+          <w:sz w:val="28"/>
+          <w:szCs w:val="24"/>
+        </w:rPr>
+        <w:t>: :</w:t>
+      </w:r>
+      <w:r>
+        <w:rPr>
+          <w:rFonts w:ascii="Times New Roman" w:hAnsi="Times New Roman" w:cs="Times New Roman"/>
+          <w:sz w:val="28"/>
+          <w:szCs w:val="24"/>
+        </w:rPr>
+        <w:t xml:space="preserve"> new (java keyword)</w:t>
+      </w:r>
+      <w:r>
+        <w:rPr>
+          <w:rFonts w:ascii="Times New Roman" w:hAnsi="Times New Roman" w:cs="Times New Roman"/>
+          <w:sz w:val="28"/>
+          <w:szCs w:val="24"/>
+        </w:rPr>
+        <w:br/>
+      </w:r>
+      <w:r>
+        <w:rPr>
+          <w:rFonts w:ascii="Times New Roman" w:hAnsi="Times New Roman" w:cs="Times New Roman"/>
+          <w:sz w:val="28"/>
+          <w:szCs w:val="24"/>
+        </w:rPr>
+        <w:br/>
+      </w:r>
+      <w:r>
+        <w:rPr>
+          <w:rFonts w:ascii="Times New Roman" w:hAnsi="Times New Roman" w:cs="Times New Roman"/>
+          <w:b/>
+          <w:bCs/>
+          <w:sz w:val="28"/>
+          <w:szCs w:val="24"/>
+          <w:u w:val="single"/>
+        </w:rPr>
+        <w:t>NOTE:-</w:t>
+      </w:r>
+      <w:r>
+        <w:rPr>
+          <w:rFonts w:ascii="Times New Roman" w:hAnsi="Times New Roman" w:cs="Times New Roman"/>
+          <w:sz w:val="28"/>
+          <w:szCs w:val="24"/>
+        </w:rPr>
+        <w:br/>
+      </w:r>
+      <w:r>
+        <w:rPr>
+          <w:rFonts w:ascii="Times New Roman" w:hAnsi="Times New Roman" w:cs="Times New Roman"/>
+          <w:sz w:val="28"/>
+          <w:szCs w:val="24"/>
+        </w:rPr>
+        <w:sym w:font="Wingdings" w:char="F0E0"/>
+      </w:r>
+      <w:r>
+        <w:rPr>
+          <w:rFonts w:ascii="Times New Roman" w:hAnsi="Times New Roman" w:cs="Times New Roman"/>
+          <w:sz w:val="28"/>
+          <w:szCs w:val="24"/>
+        </w:rPr>
+        <w:t xml:space="preserve"> For Method Reference, the parameter of the method should be same as the parameter of the Functional Interface, for Both Static and Non-Static methods</w:t>
+      </w:r>
+      <w:r>
+        <w:rPr>
+          <w:rFonts w:ascii="Times New Roman" w:hAnsi="Times New Roman" w:cs="Times New Roman"/>
+          <w:sz w:val="28"/>
+          <w:szCs w:val="24"/>
+        </w:rPr>
+        <w:br/>
+      </w:r>
+      <w:r>
+        <w:rPr>
+          <w:rFonts w:ascii="Times New Roman" w:hAnsi="Times New Roman" w:cs="Times New Roman"/>
+          <w:sz w:val="28"/>
+          <w:szCs w:val="24"/>
+        </w:rPr>
+        <w:br/>
+      </w:r>
+      <w:r>
+        <w:rPr>
+          <w:rFonts w:ascii="Times New Roman" w:hAnsi="Times New Roman" w:cs="Times New Roman"/>
+          <w:sz w:val="28"/>
+          <w:szCs w:val="24"/>
+        </w:rPr>
+        <w:sym w:font="Wingdings" w:char="F0E0"/>
+      </w:r>
+      <w:r>
+        <w:rPr>
+          <w:rFonts w:ascii="Times New Roman" w:hAnsi="Times New Roman" w:cs="Times New Roman"/>
+          <w:sz w:val="28"/>
+          <w:szCs w:val="24"/>
+        </w:rPr>
+        <w:t xml:space="preserve"> For Constructor Reference we just need to invoke using new key word BUT the parameter of the Constructor should be same as the Functional Interface</w:t>
+      </w:r>
+      <w:r>
+        <w:rPr>
+          <w:rFonts w:ascii="Times New Roman" w:hAnsi="Times New Roman" w:cs="Times New Roman"/>
+          <w:sz w:val="28"/>
+          <w:szCs w:val="24"/>
+        </w:rPr>
+        <w:br/>
+      </w:r>
+      <w:r>
+        <w:rPr>
+          <w:rFonts w:ascii="Times New Roman" w:hAnsi="Times New Roman" w:cs="Times New Roman"/>
+          <w:b/>
+          <w:bCs/>
+          <w:sz w:val="28"/>
+          <w:szCs w:val="24"/>
+        </w:rPr>
+        <w:t>Example:-</w:t>
+      </w:r>
+      <w:r>
+        <w:rPr>
+          <w:rFonts w:ascii="Times New Roman" w:hAnsi="Times New Roman" w:cs="Times New Roman"/>
+          <w:sz w:val="28"/>
+          <w:szCs w:val="24"/>
+        </w:rPr>
+        <w:br/>
+      </w:r>
+      <w:r>
+        <w:rPr>
+          <w:rFonts w:ascii="Times New Roman" w:hAnsi="Times New Roman" w:cs="Times New Roman"/>
+          <w:sz w:val="28"/>
+          <w:szCs w:val="24"/>
+        </w:rPr>
+        <w:sym w:font="Wingdings" w:char="F0E0"/>
+      </w:r>
       <w:r>
         <w:rPr>
           <w:rFonts w:ascii="Times New Roman" w:hAnsi="Times New Roman" w:cs="Times New Roman"/>
@@ -4272,12 +4435,42 @@
       <w:r>
         <w:rPr>
           <w:rFonts w:ascii="Times New Roman" w:hAnsi="Times New Roman" w:cs="Times New Roman"/>
-          <w:b/>
-          <w:bCs/>
-          <w:sz w:val="28"/>
-          <w:szCs w:val="24"/>
-        </w:rPr>
-        <w:t>: :</w:t>
+          <w:sz w:val="28"/>
+          <w:szCs w:val="24"/>
+        </w:rPr>
+        <w:t xml:space="preserve">For Single args Costructor we can use </w:t>
+      </w:r>
+      <w:r>
+        <w:rPr>
+          <w:rFonts w:ascii="Times New Roman" w:hAnsi="Times New Roman" w:cs="Times New Roman"/>
+          <w:sz w:val="28"/>
+          <w:szCs w:val="24"/>
+        </w:rPr>
+        <w:sym w:font="Wingdings" w:char="F0E0"/>
+      </w:r>
+      <w:r>
+        <w:rPr>
+          <w:rFonts w:ascii="Times New Roman" w:hAnsi="Times New Roman" w:cs="Times New Roman"/>
+          <w:sz w:val="28"/>
+          <w:szCs w:val="24"/>
+        </w:rPr>
+        <w:t xml:space="preserve"> Consumer (FI), where it takes single parameter for its Abstract method, where Both Should match</w:t>
+      </w:r>
+      <w:r>
+        <w:rPr>
+          <w:rFonts w:ascii="Times New Roman" w:hAnsi="Times New Roman" w:cs="Times New Roman"/>
+          <w:sz w:val="28"/>
+          <w:szCs w:val="24"/>
+        </w:rPr>
+        <w:br/>
+      </w:r>
+      <w:r>
+        <w:rPr>
+          <w:rFonts w:ascii="Times New Roman" w:hAnsi="Times New Roman" w:cs="Times New Roman"/>
+          <w:sz w:val="28"/>
+          <w:szCs w:val="24"/>
+        </w:rPr>
+        <w:sym w:font="Wingdings" w:char="F0E0"/>
       </w:r>
       <w:r>
         <w:rPr>
@@ -4287,308 +4480,29 @@
         </w:rPr>
         <w:t xml:space="preserve"> </w:t>
       </w:r>
-      <w:proofErr w:type="spellStart"/>
-      <w:r>
-        <w:rPr>
-          <w:rFonts w:ascii="Times New Roman" w:hAnsi="Times New Roman" w:cs="Times New Roman"/>
-          <w:sz w:val="28"/>
-          <w:szCs w:val="24"/>
-        </w:rPr>
-        <w:t>Static_Method_Name</w:t>
-      </w:r>
-      <w:proofErr w:type="spellEnd"/>
-      <w:r>
-        <w:rPr>
-          <w:rFonts w:ascii="Times New Roman" w:hAnsi="Times New Roman" w:cs="Times New Roman"/>
-          <w:sz w:val="28"/>
-          <w:szCs w:val="24"/>
-        </w:rPr>
-        <w:br/>
-      </w:r>
-      <w:r>
-        <w:rPr>
-          <w:rFonts w:ascii="Times New Roman" w:hAnsi="Times New Roman" w:cs="Times New Roman"/>
-          <w:sz w:val="28"/>
-          <w:szCs w:val="24"/>
-        </w:rPr>
-        <w:br/>
-      </w:r>
-      <w:bookmarkStart w:id="0" w:name="_Hlk168615670"/>
-      <w:r>
-        <w:rPr>
-          <w:rFonts w:ascii="Times New Roman" w:hAnsi="Times New Roman" w:cs="Times New Roman"/>
-          <w:b/>
-          <w:bCs/>
-          <w:sz w:val="28"/>
-          <w:szCs w:val="24"/>
-          <w:u w:val="single"/>
-        </w:rPr>
-        <w:t xml:space="preserve">Syntax For </w:t>
-      </w:r>
-      <w:r>
-        <w:rPr>
-          <w:rFonts w:ascii="Times New Roman" w:hAnsi="Times New Roman" w:cs="Times New Roman"/>
-          <w:b/>
-          <w:bCs/>
-          <w:sz w:val="28"/>
-          <w:szCs w:val="24"/>
-          <w:u w:val="single"/>
-        </w:rPr>
-        <w:t>Non-</w:t>
-      </w:r>
-      <w:r>
-        <w:rPr>
-          <w:rFonts w:ascii="Times New Roman" w:hAnsi="Times New Roman" w:cs="Times New Roman"/>
-          <w:b/>
-          <w:bCs/>
-          <w:sz w:val="28"/>
-          <w:szCs w:val="24"/>
-          <w:u w:val="single"/>
-        </w:rPr>
-        <w:t>Static method</w:t>
-      </w:r>
-      <w:r>
-        <w:rPr>
-          <w:rFonts w:ascii="Times New Roman" w:hAnsi="Times New Roman" w:cs="Times New Roman"/>
-          <w:b/>
-          <w:bCs/>
-          <w:sz w:val="28"/>
-          <w:szCs w:val="24"/>
-          <w:u w:val="single"/>
-        </w:rPr>
-        <w:t xml:space="preserve"> </w:t>
-      </w:r>
-      <w:r>
-        <w:rPr>
-          <w:rFonts w:ascii="Times New Roman" w:hAnsi="Times New Roman" w:cs="Times New Roman"/>
-          <w:b/>
-          <w:bCs/>
-          <w:sz w:val="28"/>
-          <w:szCs w:val="24"/>
-          <w:u w:val="single"/>
-        </w:rPr>
-        <w:t>Reference</w:t>
-      </w:r>
-      <w:r>
-        <w:rPr>
-          <w:rFonts w:ascii="Times New Roman" w:hAnsi="Times New Roman" w:cs="Times New Roman"/>
-          <w:b/>
-          <w:bCs/>
-          <w:sz w:val="28"/>
-          <w:szCs w:val="24"/>
-          <w:u w:val="single"/>
-        </w:rPr>
-        <w:t>:-</w:t>
-      </w:r>
-      <w:r>
-        <w:rPr>
-          <w:rFonts w:ascii="Times New Roman" w:hAnsi="Times New Roman" w:cs="Times New Roman"/>
-          <w:sz w:val="28"/>
-          <w:szCs w:val="24"/>
-        </w:rPr>
-        <w:br/>
-      </w:r>
-      <w:proofErr w:type="spellStart"/>
-      <w:r>
-        <w:rPr>
-          <w:rFonts w:ascii="Times New Roman" w:hAnsi="Times New Roman" w:cs="Times New Roman"/>
-          <w:sz w:val="28"/>
-          <w:szCs w:val="24"/>
-        </w:rPr>
-        <w:t>Object_Reference</w:t>
-      </w:r>
-      <w:proofErr w:type="spellEnd"/>
-      <w:r>
-        <w:rPr>
-          <w:rFonts w:ascii="Times New Roman" w:hAnsi="Times New Roman" w:cs="Times New Roman"/>
-          <w:sz w:val="28"/>
-          <w:szCs w:val="24"/>
-        </w:rPr>
-        <w:t xml:space="preserve"> </w:t>
-      </w:r>
-      <w:r>
-        <w:rPr>
-          <w:rFonts w:ascii="Times New Roman" w:hAnsi="Times New Roman" w:cs="Times New Roman"/>
-          <w:b/>
-          <w:bCs/>
-          <w:sz w:val="28"/>
-          <w:szCs w:val="24"/>
-        </w:rPr>
-        <w:t>: :</w:t>
-      </w:r>
-      <w:r>
-        <w:rPr>
-          <w:rFonts w:ascii="Times New Roman" w:hAnsi="Times New Roman" w:cs="Times New Roman"/>
-          <w:sz w:val="28"/>
-          <w:szCs w:val="24"/>
-        </w:rPr>
-        <w:t xml:space="preserve"> </w:t>
-      </w:r>
-      <w:proofErr w:type="spellStart"/>
-      <w:r>
-        <w:rPr>
-          <w:rFonts w:ascii="Times New Roman" w:hAnsi="Times New Roman" w:cs="Times New Roman"/>
-          <w:sz w:val="28"/>
-          <w:szCs w:val="24"/>
-        </w:rPr>
-        <w:t>Non_</w:t>
-      </w:r>
-      <w:r>
-        <w:rPr>
-          <w:rFonts w:ascii="Times New Roman" w:hAnsi="Times New Roman" w:cs="Times New Roman"/>
-          <w:sz w:val="28"/>
-          <w:szCs w:val="24"/>
-        </w:rPr>
-        <w:t>Static_Method_Name</w:t>
-      </w:r>
-      <w:bookmarkEnd w:id="0"/>
-      <w:proofErr w:type="spellEnd"/>
-      <w:r>
-        <w:rPr>
-          <w:rFonts w:ascii="Times New Roman" w:hAnsi="Times New Roman" w:cs="Times New Roman"/>
-          <w:sz w:val="28"/>
-          <w:szCs w:val="24"/>
-        </w:rPr>
-        <w:br/>
-      </w:r>
-      <w:r>
-        <w:rPr>
-          <w:rFonts w:ascii="Times New Roman" w:hAnsi="Times New Roman" w:cs="Times New Roman"/>
-          <w:sz w:val="28"/>
-          <w:szCs w:val="24"/>
-        </w:rPr>
-        <w:br/>
-      </w:r>
-      <w:r>
-        <w:rPr>
-          <w:rFonts w:ascii="Times New Roman" w:hAnsi="Times New Roman" w:cs="Times New Roman"/>
-          <w:b/>
-          <w:bCs/>
-          <w:sz w:val="28"/>
-          <w:szCs w:val="24"/>
-          <w:u w:val="single"/>
-        </w:rPr>
-        <w:t xml:space="preserve">Syntax For </w:t>
-      </w:r>
-      <w:r>
-        <w:rPr>
-          <w:rFonts w:ascii="Times New Roman" w:hAnsi="Times New Roman" w:cs="Times New Roman"/>
-          <w:b/>
-          <w:bCs/>
-          <w:sz w:val="28"/>
-          <w:szCs w:val="24"/>
-          <w:u w:val="single"/>
-        </w:rPr>
-        <w:t xml:space="preserve">Constructor </w:t>
-      </w:r>
-      <w:r>
-        <w:rPr>
-          <w:rFonts w:ascii="Times New Roman" w:hAnsi="Times New Roman" w:cs="Times New Roman"/>
-          <w:b/>
-          <w:bCs/>
-          <w:sz w:val="28"/>
-          <w:szCs w:val="24"/>
-          <w:u w:val="single"/>
-        </w:rPr>
-        <w:t>Reference</w:t>
-      </w:r>
-      <w:r>
-        <w:rPr>
-          <w:rFonts w:ascii="Times New Roman" w:hAnsi="Times New Roman" w:cs="Times New Roman"/>
-          <w:b/>
-          <w:bCs/>
-          <w:sz w:val="28"/>
-          <w:szCs w:val="24"/>
-          <w:u w:val="single"/>
-        </w:rPr>
-        <w:t>:-</w:t>
-      </w:r>
-      <w:r>
-        <w:rPr>
-          <w:rFonts w:ascii="Times New Roman" w:hAnsi="Times New Roman" w:cs="Times New Roman"/>
-          <w:sz w:val="28"/>
-          <w:szCs w:val="24"/>
-        </w:rPr>
-        <w:br/>
-      </w:r>
-      <w:proofErr w:type="spellStart"/>
-      <w:r>
-        <w:rPr>
-          <w:rFonts w:ascii="Times New Roman" w:hAnsi="Times New Roman" w:cs="Times New Roman"/>
-          <w:sz w:val="28"/>
-          <w:szCs w:val="24"/>
-        </w:rPr>
-        <w:t>Class_Name</w:t>
-      </w:r>
-      <w:proofErr w:type="spellEnd"/>
-      <w:r>
-        <w:rPr>
-          <w:rFonts w:ascii="Times New Roman" w:hAnsi="Times New Roman" w:cs="Times New Roman"/>
-          <w:sz w:val="28"/>
-          <w:szCs w:val="24"/>
-        </w:rPr>
-        <w:t xml:space="preserve"> </w:t>
-      </w:r>
-      <w:r>
-        <w:rPr>
-          <w:rFonts w:ascii="Times New Roman" w:hAnsi="Times New Roman" w:cs="Times New Roman"/>
-          <w:b/>
-          <w:bCs/>
-          <w:sz w:val="28"/>
-          <w:szCs w:val="24"/>
-        </w:rPr>
-        <w:t>: :</w:t>
-      </w:r>
-      <w:r>
-        <w:rPr>
-          <w:rFonts w:ascii="Times New Roman" w:hAnsi="Times New Roman" w:cs="Times New Roman"/>
-          <w:sz w:val="28"/>
-          <w:szCs w:val="24"/>
-        </w:rPr>
-        <w:t xml:space="preserve"> </w:t>
-      </w:r>
-      <w:r>
-        <w:rPr>
-          <w:rFonts w:ascii="Times New Roman" w:hAnsi="Times New Roman" w:cs="Times New Roman"/>
-          <w:sz w:val="28"/>
-          <w:szCs w:val="24"/>
-        </w:rPr>
-        <w:t>new (java keyword)</w:t>
-      </w:r>
-      <w:r>
-        <w:rPr>
-          <w:rFonts w:ascii="Times New Roman" w:hAnsi="Times New Roman" w:cs="Times New Roman"/>
-          <w:sz w:val="28"/>
-          <w:szCs w:val="24"/>
-        </w:rPr>
-        <w:br/>
-      </w:r>
-      <w:r>
-        <w:rPr>
-          <w:rFonts w:ascii="Times New Roman" w:hAnsi="Times New Roman" w:cs="Times New Roman"/>
-          <w:sz w:val="28"/>
-          <w:szCs w:val="24"/>
-        </w:rPr>
-        <w:br/>
-      </w:r>
-      <w:r>
-        <w:rPr>
-          <w:rFonts w:ascii="Times New Roman" w:hAnsi="Times New Roman" w:cs="Times New Roman"/>
-          <w:b/>
-          <w:bCs/>
-          <w:sz w:val="28"/>
-          <w:szCs w:val="24"/>
-          <w:u w:val="single"/>
-        </w:rPr>
-        <w:t>NOTE:-</w:t>
-      </w:r>
-      <w:r>
-        <w:rPr>
-          <w:rFonts w:ascii="Times New Roman" w:hAnsi="Times New Roman" w:cs="Times New Roman"/>
-          <w:sz w:val="28"/>
-          <w:szCs w:val="24"/>
-        </w:rPr>
-        <w:br/>
+      <w:r>
+        <w:rPr>
+          <w:rFonts w:ascii="Times New Roman" w:hAnsi="Times New Roman" w:cs="Times New Roman"/>
+          <w:sz w:val="28"/>
+          <w:szCs w:val="24"/>
+        </w:rPr>
+        <w:t xml:space="preserve">For </w:t>
+      </w:r>
+      <w:r>
+        <w:rPr>
+          <w:rFonts w:ascii="Times New Roman" w:hAnsi="Times New Roman" w:cs="Times New Roman"/>
+          <w:sz w:val="28"/>
+          <w:szCs w:val="24"/>
+        </w:rPr>
+        <w:t>N</w:t>
+      </w:r>
+      <w:r>
+        <w:rPr>
+          <w:rFonts w:ascii="Times New Roman" w:hAnsi="Times New Roman" w:cs="Times New Roman"/>
+          <w:sz w:val="28"/>
+          <w:szCs w:val="24"/>
+        </w:rPr>
+        <w:t xml:space="preserve">o Constructor we can use </w:t>
       </w:r>
       <w:r>
         <w:rPr>
@@ -4604,245 +4518,7 @@
           <w:sz w:val="28"/>
           <w:szCs w:val="24"/>
         </w:rPr>
-        <w:t xml:space="preserve"> For Method Reference, the parameter of the method should be same as the parameter of the Functional Interface, for Both Static and Non-Static methods</w:t>
-      </w:r>
-      <w:r>
-        <w:rPr>
-          <w:rFonts w:ascii="Times New Roman" w:hAnsi="Times New Roman" w:cs="Times New Roman"/>
-          <w:sz w:val="28"/>
-          <w:szCs w:val="24"/>
-        </w:rPr>
-        <w:br/>
-      </w:r>
-      <w:r>
-        <w:rPr>
-          <w:rFonts w:ascii="Times New Roman" w:hAnsi="Times New Roman" w:cs="Times New Roman"/>
-          <w:sz w:val="28"/>
-          <w:szCs w:val="24"/>
-        </w:rPr>
-        <w:br/>
-      </w:r>
-      <w:r>
-        <w:rPr>
-          <w:rFonts w:ascii="Times New Roman" w:hAnsi="Times New Roman" w:cs="Times New Roman"/>
-          <w:sz w:val="28"/>
-          <w:szCs w:val="24"/>
-        </w:rPr>
-        <w:sym w:font="Wingdings" w:char="F0E0"/>
-      </w:r>
-      <w:r>
-        <w:rPr>
-          <w:rFonts w:ascii="Times New Roman" w:hAnsi="Times New Roman" w:cs="Times New Roman"/>
-          <w:sz w:val="28"/>
-          <w:szCs w:val="24"/>
-        </w:rPr>
-        <w:t xml:space="preserve"> For Constructor Reference we just need to invoke using new key word BUT the parameter of the Constructor should be same as the Functional Interface</w:t>
-      </w:r>
-      <w:r>
-        <w:rPr>
-          <w:rFonts w:ascii="Times New Roman" w:hAnsi="Times New Roman" w:cs="Times New Roman"/>
-          <w:sz w:val="28"/>
-          <w:szCs w:val="24"/>
-        </w:rPr>
-        <w:br/>
-      </w:r>
-      <w:r>
-        <w:rPr>
-          <w:rFonts w:ascii="Times New Roman" w:hAnsi="Times New Roman" w:cs="Times New Roman"/>
-          <w:b/>
-          <w:bCs/>
-          <w:sz w:val="28"/>
-          <w:szCs w:val="24"/>
-        </w:rPr>
-        <w:t>Example:-</w:t>
-      </w:r>
-      <w:r>
-        <w:rPr>
-          <w:rFonts w:ascii="Times New Roman" w:hAnsi="Times New Roman" w:cs="Times New Roman"/>
-          <w:sz w:val="28"/>
-          <w:szCs w:val="24"/>
-        </w:rPr>
-        <w:br/>
-      </w:r>
-      <w:r>
-        <w:rPr>
-          <w:rFonts w:ascii="Times New Roman" w:hAnsi="Times New Roman" w:cs="Times New Roman"/>
-          <w:sz w:val="28"/>
-          <w:szCs w:val="24"/>
-        </w:rPr>
-        <w:sym w:font="Wingdings" w:char="F0E0"/>
-      </w:r>
-      <w:r>
-        <w:rPr>
-          <w:rFonts w:ascii="Times New Roman" w:hAnsi="Times New Roman" w:cs="Times New Roman"/>
-          <w:sz w:val="28"/>
-          <w:szCs w:val="24"/>
-        </w:rPr>
-        <w:t xml:space="preserve"> </w:t>
-      </w:r>
-      <w:r>
-        <w:rPr>
-          <w:rFonts w:ascii="Times New Roman" w:hAnsi="Times New Roman" w:cs="Times New Roman"/>
-          <w:sz w:val="28"/>
-          <w:szCs w:val="24"/>
-        </w:rPr>
-        <w:t xml:space="preserve">For Single </w:t>
-      </w:r>
-      <w:proofErr w:type="spellStart"/>
-      <w:r>
-        <w:rPr>
-          <w:rFonts w:ascii="Times New Roman" w:hAnsi="Times New Roman" w:cs="Times New Roman"/>
-          <w:sz w:val="28"/>
-          <w:szCs w:val="24"/>
-        </w:rPr>
-        <w:t>args</w:t>
-      </w:r>
-      <w:proofErr w:type="spellEnd"/>
-      <w:r>
-        <w:rPr>
-          <w:rFonts w:ascii="Times New Roman" w:hAnsi="Times New Roman" w:cs="Times New Roman"/>
-          <w:sz w:val="28"/>
-          <w:szCs w:val="24"/>
-        </w:rPr>
-        <w:t xml:space="preserve"> </w:t>
-      </w:r>
-      <w:proofErr w:type="spellStart"/>
-      <w:r>
-        <w:rPr>
-          <w:rFonts w:ascii="Times New Roman" w:hAnsi="Times New Roman" w:cs="Times New Roman"/>
-          <w:sz w:val="28"/>
-          <w:szCs w:val="24"/>
-        </w:rPr>
-        <w:t>Costructor</w:t>
-      </w:r>
-      <w:proofErr w:type="spellEnd"/>
-      <w:r>
-        <w:rPr>
-          <w:rFonts w:ascii="Times New Roman" w:hAnsi="Times New Roman" w:cs="Times New Roman"/>
-          <w:sz w:val="28"/>
-          <w:szCs w:val="24"/>
-        </w:rPr>
-        <w:t xml:space="preserve"> we can use </w:t>
-      </w:r>
-      <w:r>
-        <w:rPr>
-          <w:rFonts w:ascii="Times New Roman" w:hAnsi="Times New Roman" w:cs="Times New Roman"/>
-          <w:sz w:val="28"/>
-          <w:szCs w:val="24"/>
-        </w:rPr>
-        <w:sym w:font="Wingdings" w:char="F0E0"/>
-      </w:r>
-      <w:r>
-        <w:rPr>
-          <w:rFonts w:ascii="Times New Roman" w:hAnsi="Times New Roman" w:cs="Times New Roman"/>
-          <w:sz w:val="28"/>
-          <w:szCs w:val="24"/>
-        </w:rPr>
-        <w:t xml:space="preserve"> Consumer (FI), where it takes single parameter for its Abstract method, where Both Should match</w:t>
-      </w:r>
-      <w:r>
-        <w:rPr>
-          <w:rFonts w:ascii="Times New Roman" w:hAnsi="Times New Roman" w:cs="Times New Roman"/>
-          <w:sz w:val="28"/>
-          <w:szCs w:val="24"/>
-        </w:rPr>
-        <w:br/>
-      </w:r>
-      <w:r>
-        <w:rPr>
-          <w:rFonts w:ascii="Times New Roman" w:hAnsi="Times New Roman" w:cs="Times New Roman"/>
-          <w:sz w:val="28"/>
-          <w:szCs w:val="24"/>
-        </w:rPr>
-        <w:sym w:font="Wingdings" w:char="F0E0"/>
-      </w:r>
-      <w:r>
-        <w:rPr>
-          <w:rFonts w:ascii="Times New Roman" w:hAnsi="Times New Roman" w:cs="Times New Roman"/>
-          <w:sz w:val="28"/>
-          <w:szCs w:val="24"/>
-        </w:rPr>
-        <w:t xml:space="preserve"> </w:t>
-      </w:r>
-      <w:r>
-        <w:rPr>
-          <w:rFonts w:ascii="Times New Roman" w:hAnsi="Times New Roman" w:cs="Times New Roman"/>
-          <w:sz w:val="28"/>
-          <w:szCs w:val="24"/>
-        </w:rPr>
-        <w:t xml:space="preserve">For </w:t>
-      </w:r>
-      <w:r>
-        <w:rPr>
-          <w:rFonts w:ascii="Times New Roman" w:hAnsi="Times New Roman" w:cs="Times New Roman"/>
-          <w:sz w:val="28"/>
-          <w:szCs w:val="24"/>
-        </w:rPr>
-        <w:t>N</w:t>
-      </w:r>
-      <w:r>
-        <w:rPr>
-          <w:rFonts w:ascii="Times New Roman" w:hAnsi="Times New Roman" w:cs="Times New Roman"/>
-          <w:sz w:val="28"/>
-          <w:szCs w:val="24"/>
-        </w:rPr>
-        <w:t>o</w:t>
-      </w:r>
-      <w:r>
-        <w:rPr>
-          <w:rFonts w:ascii="Times New Roman" w:hAnsi="Times New Roman" w:cs="Times New Roman"/>
-          <w:sz w:val="28"/>
-          <w:szCs w:val="24"/>
-        </w:rPr>
-        <w:t xml:space="preserve"> Co</w:t>
-      </w:r>
-      <w:r>
-        <w:rPr>
-          <w:rFonts w:ascii="Times New Roman" w:hAnsi="Times New Roman" w:cs="Times New Roman"/>
-          <w:sz w:val="28"/>
-          <w:szCs w:val="24"/>
-        </w:rPr>
-        <w:t>ns</w:t>
-      </w:r>
-      <w:r>
-        <w:rPr>
-          <w:rFonts w:ascii="Times New Roman" w:hAnsi="Times New Roman" w:cs="Times New Roman"/>
-          <w:sz w:val="28"/>
-          <w:szCs w:val="24"/>
-        </w:rPr>
-        <w:t xml:space="preserve">tructor we can use </w:t>
-      </w:r>
-      <w:r>
-        <w:rPr>
-          <w:rFonts w:ascii="Times New Roman" w:hAnsi="Times New Roman" w:cs="Times New Roman"/>
-          <w:sz w:val="28"/>
-          <w:szCs w:val="24"/>
-        </w:rPr>
-        <w:sym w:font="Wingdings" w:char="F0E0"/>
-      </w:r>
-      <w:r>
-        <w:rPr>
-          <w:rFonts w:ascii="Times New Roman" w:hAnsi="Times New Roman" w:cs="Times New Roman"/>
-          <w:sz w:val="28"/>
-          <w:szCs w:val="24"/>
-        </w:rPr>
-        <w:t xml:space="preserve"> </w:t>
-      </w:r>
-      <w:r>
-        <w:rPr>
-          <w:rFonts w:ascii="Times New Roman" w:hAnsi="Times New Roman" w:cs="Times New Roman"/>
-          <w:sz w:val="28"/>
-          <w:szCs w:val="24"/>
-        </w:rPr>
-        <w:t xml:space="preserve">Supplier </w:t>
-      </w:r>
-      <w:r>
-        <w:rPr>
-          <w:rFonts w:ascii="Times New Roman" w:hAnsi="Times New Roman" w:cs="Times New Roman"/>
-          <w:sz w:val="28"/>
-          <w:szCs w:val="24"/>
-        </w:rPr>
-        <w:t xml:space="preserve">(FI), where it takes </w:t>
+        <w:t xml:space="preserve"> Supplier (FI), where it takes </w:t>
       </w:r>
       <w:r>
         <w:rPr>

</xml_diff>